<commit_message>
Aggiunta di file per Testing
Da implementare con percentuali EclEmma
</commit_message>
<xml_diff>
--- a/documentazione/Testing.docx
+++ b/documentazione/Testing.docx
@@ -35,6 +35,1269 @@
       </w:r>
     </w:p>
     <w:p/>
+    <w:p>
+      <w:pPr>
+        <w:rPr>
+          <w:i/>
+          <w:iCs/>
+          <w:u w:val="single"/>
+        </w:rPr>
+      </w:pPr>
+      <w:r>
+        <w:rPr>
+          <w:i/>
+          <w:iCs/>
+          <w:u w:val="single"/>
+        </w:rPr>
+        <w:t>Strategia di Test/Test Plan</w:t>
+      </w:r>
+    </w:p>
+    <w:p>
+      <w:r>
+        <w:t>Il team ha attutato una strategia di test White Box per verificare le funzionalità implementate e il codice interno.</w:t>
+      </w:r>
+    </w:p>
+    <w:p>
+      <w:r>
+        <w:t>L’attività di testing è stata suddivisa in:</w:t>
+      </w:r>
+    </w:p>
+    <w:p>
+      <w:pPr>
+        <w:pStyle w:val="Paragrafoelenco"/>
+        <w:numPr>
+          <w:ilvl w:val="0"/>
+          <w:numId w:val="1"/>
+        </w:numPr>
+      </w:pPr>
+      <w:r>
+        <w:t>Unit Testing: utilizzo di JUnit5 per testare logica di business e validazione dei dati</w:t>
+      </w:r>
+    </w:p>
+    <w:p>
+      <w:pPr>
+        <w:pStyle w:val="Paragrafoelenco"/>
+        <w:numPr>
+          <w:ilvl w:val="0"/>
+          <w:numId w:val="1"/>
+        </w:numPr>
+      </w:pPr>
+      <w:r>
+        <w:t>Manual Testing: test manuale in seguito ad ogni modifica effettuata e prima di ogni commit</w:t>
+      </w:r>
+    </w:p>
+    <w:p>
+      <w:pPr>
+        <w:rPr>
+          <w:i/>
+          <w:iCs/>
+          <w:u w:val="single"/>
+        </w:rPr>
+      </w:pPr>
+    </w:p>
+    <w:p>
+      <w:pPr>
+        <w:rPr>
+          <w:i/>
+          <w:iCs/>
+          <w:u w:val="single"/>
+        </w:rPr>
+      </w:pPr>
+      <w:r>
+        <w:rPr>
+          <w:i/>
+          <w:iCs/>
+          <w:u w:val="single"/>
+        </w:rPr>
+        <w:t>Test Implementati</w:t>
+      </w:r>
+    </w:p>
+    <w:tbl>
+      <w:tblPr>
+        <w:tblW w:w="0" w:type="auto"/>
+        <w:tblCellSpacing w:w="15" w:type="dxa"/>
+        <w:tblCellMar>
+          <w:left w:w="0" w:type="dxa"/>
+          <w:right w:w="0" w:type="dxa"/>
+        </w:tblCellMar>
+        <w:tblLook w:val="04A0" w:firstRow="1" w:lastRow="0" w:firstColumn="1" w:lastColumn="0" w:noHBand="0" w:noVBand="1"/>
+      </w:tblPr>
+      <w:tblGrid>
+        <w:gridCol w:w="2056"/>
+        <w:gridCol w:w="1817"/>
+        <w:gridCol w:w="5749"/>
+      </w:tblGrid>
+      <w:tr>
+        <w:trPr>
+          <w:tblHeader/>
+          <w:tblCellSpacing w:w="15" w:type="dxa"/>
+        </w:trPr>
+        <w:tc>
+          <w:tcPr>
+            <w:tcW w:w="0" w:type="auto"/>
+            <w:tcBorders>
+              <w:top w:val="single" w:sz="6" w:space="0" w:color="auto"/>
+              <w:left w:val="single" w:sz="6" w:space="0" w:color="auto"/>
+              <w:bottom w:val="single" w:sz="6" w:space="0" w:color="auto"/>
+              <w:right w:val="single" w:sz="6" w:space="0" w:color="auto"/>
+            </w:tcBorders>
+            <w:tcMar>
+              <w:top w:w="120" w:type="dxa"/>
+              <w:left w:w="180" w:type="dxa"/>
+              <w:bottom w:w="120" w:type="dxa"/>
+              <w:right w:w="180" w:type="dxa"/>
+            </w:tcMar>
+            <w:vAlign w:val="center"/>
+            <w:hideMark/>
+          </w:tcPr>
+          <w:p>
+            <w:pPr>
+              <w:jc w:val="center"/>
+            </w:pPr>
+            <w:r>
+              <w:rPr>
+                <w:b/>
+                <w:bCs/>
+              </w:rPr>
+              <w:t>Classe di Test</w:t>
+            </w:r>
+          </w:p>
+        </w:tc>
+        <w:tc>
+          <w:tcPr>
+            <w:tcW w:w="0" w:type="auto"/>
+            <w:tcBorders>
+              <w:top w:val="single" w:sz="6" w:space="0" w:color="auto"/>
+              <w:left w:val="single" w:sz="6" w:space="0" w:color="auto"/>
+              <w:bottom w:val="single" w:sz="6" w:space="0" w:color="auto"/>
+              <w:right w:val="single" w:sz="6" w:space="0" w:color="auto"/>
+            </w:tcBorders>
+            <w:tcMar>
+              <w:top w:w="120" w:type="dxa"/>
+              <w:left w:w="180" w:type="dxa"/>
+              <w:bottom w:w="120" w:type="dxa"/>
+              <w:right w:w="180" w:type="dxa"/>
+            </w:tcMar>
+            <w:vAlign w:val="center"/>
+            <w:hideMark/>
+          </w:tcPr>
+          <w:p>
+            <w:pPr>
+              <w:jc w:val="center"/>
+            </w:pPr>
+            <w:r>
+              <w:rPr>
+                <w:b/>
+                <w:bCs/>
+              </w:rPr>
+              <w:t>Classe Testata</w:t>
+            </w:r>
+          </w:p>
+        </w:tc>
+        <w:tc>
+          <w:tcPr>
+            <w:tcW w:w="0" w:type="auto"/>
+            <w:tcBorders>
+              <w:top w:val="single" w:sz="6" w:space="0" w:color="auto"/>
+              <w:left w:val="single" w:sz="6" w:space="0" w:color="auto"/>
+              <w:bottom w:val="single" w:sz="6" w:space="0" w:color="auto"/>
+              <w:right w:val="single" w:sz="6" w:space="0" w:color="auto"/>
+            </w:tcBorders>
+            <w:tcMar>
+              <w:top w:w="120" w:type="dxa"/>
+              <w:left w:w="180" w:type="dxa"/>
+              <w:bottom w:w="120" w:type="dxa"/>
+              <w:right w:w="180" w:type="dxa"/>
+            </w:tcMar>
+            <w:vAlign w:val="center"/>
+            <w:hideMark/>
+          </w:tcPr>
+          <w:p>
+            <w:pPr>
+              <w:jc w:val="center"/>
+              <w:rPr>
+                <w:b/>
+                <w:bCs/>
+              </w:rPr>
+            </w:pPr>
+            <w:r>
+              <w:rPr>
+                <w:b/>
+                <w:bCs/>
+              </w:rPr>
+              <w:t>Obiettivo Test</w:t>
+            </w:r>
+          </w:p>
+        </w:tc>
+      </w:tr>
+      <w:tr>
+        <w:trPr>
+          <w:tblCellSpacing w:w="15" w:type="dxa"/>
+        </w:trPr>
+        <w:tc>
+          <w:tcPr>
+            <w:tcW w:w="0" w:type="auto"/>
+            <w:tcBorders>
+              <w:top w:val="single" w:sz="6" w:space="0" w:color="auto"/>
+              <w:left w:val="single" w:sz="6" w:space="0" w:color="auto"/>
+              <w:bottom w:val="single" w:sz="6" w:space="0" w:color="auto"/>
+              <w:right w:val="single" w:sz="6" w:space="0" w:color="auto"/>
+            </w:tcBorders>
+            <w:tcMar>
+              <w:top w:w="120" w:type="dxa"/>
+              <w:left w:w="180" w:type="dxa"/>
+              <w:bottom w:w="120" w:type="dxa"/>
+              <w:right w:w="180" w:type="dxa"/>
+            </w:tcMar>
+            <w:vAlign w:val="center"/>
+            <w:hideMark/>
+          </w:tcPr>
+          <w:p>
+            <w:pPr>
+              <w:jc w:val="center"/>
+            </w:pPr>
+            <w:r>
+              <w:rPr>
+                <w:b/>
+                <w:bCs/>
+              </w:rPr>
+              <w:t>DataValidatorTest</w:t>
+            </w:r>
+          </w:p>
+        </w:tc>
+        <w:tc>
+          <w:tcPr>
+            <w:tcW w:w="0" w:type="auto"/>
+            <w:tcBorders>
+              <w:top w:val="single" w:sz="6" w:space="0" w:color="auto"/>
+              <w:left w:val="single" w:sz="6" w:space="0" w:color="auto"/>
+              <w:bottom w:val="single" w:sz="6" w:space="0" w:color="auto"/>
+              <w:right w:val="single" w:sz="6" w:space="0" w:color="auto"/>
+            </w:tcBorders>
+            <w:tcMar>
+              <w:top w:w="120" w:type="dxa"/>
+              <w:left w:w="180" w:type="dxa"/>
+              <w:bottom w:w="120" w:type="dxa"/>
+              <w:right w:w="180" w:type="dxa"/>
+            </w:tcMar>
+            <w:vAlign w:val="center"/>
+            <w:hideMark/>
+          </w:tcPr>
+          <w:p>
+            <w:pPr>
+              <w:jc w:val="center"/>
+            </w:pPr>
+            <w:r>
+              <w:t>DataValidator</w:t>
+            </w:r>
+          </w:p>
+        </w:tc>
+        <w:tc>
+          <w:tcPr>
+            <w:tcW w:w="0" w:type="auto"/>
+            <w:tcBorders>
+              <w:top w:val="single" w:sz="6" w:space="0" w:color="auto"/>
+              <w:left w:val="single" w:sz="6" w:space="0" w:color="auto"/>
+              <w:bottom w:val="single" w:sz="6" w:space="0" w:color="auto"/>
+              <w:right w:val="single" w:sz="6" w:space="0" w:color="auto"/>
+            </w:tcBorders>
+            <w:tcMar>
+              <w:top w:w="120" w:type="dxa"/>
+              <w:left w:w="180" w:type="dxa"/>
+              <w:bottom w:w="120" w:type="dxa"/>
+              <w:right w:w="180" w:type="dxa"/>
+            </w:tcMar>
+            <w:vAlign w:val="center"/>
+            <w:hideMark/>
+          </w:tcPr>
+          <w:p>
+            <w:pPr>
+              <w:jc w:val="center"/>
+            </w:pPr>
+            <w:r>
+              <w:t>Validazione dati inseriti in input</w:t>
+            </w:r>
+          </w:p>
+        </w:tc>
+      </w:tr>
+      <w:tr>
+        <w:trPr>
+          <w:tblCellSpacing w:w="15" w:type="dxa"/>
+        </w:trPr>
+        <w:tc>
+          <w:tcPr>
+            <w:tcW w:w="0" w:type="auto"/>
+            <w:tcBorders>
+              <w:top w:val="single" w:sz="6" w:space="0" w:color="auto"/>
+              <w:left w:val="single" w:sz="6" w:space="0" w:color="auto"/>
+              <w:bottom w:val="single" w:sz="6" w:space="0" w:color="auto"/>
+              <w:right w:val="single" w:sz="6" w:space="0" w:color="auto"/>
+            </w:tcBorders>
+            <w:tcMar>
+              <w:top w:w="120" w:type="dxa"/>
+              <w:left w:w="180" w:type="dxa"/>
+              <w:bottom w:w="120" w:type="dxa"/>
+              <w:right w:w="180" w:type="dxa"/>
+            </w:tcMar>
+            <w:vAlign w:val="center"/>
+            <w:hideMark/>
+          </w:tcPr>
+          <w:p>
+            <w:pPr>
+              <w:jc w:val="center"/>
+            </w:pPr>
+            <w:r>
+              <w:rPr>
+                <w:b/>
+                <w:bCs/>
+              </w:rPr>
+              <w:t>AutoTest</w:t>
+            </w:r>
+          </w:p>
+        </w:tc>
+        <w:tc>
+          <w:tcPr>
+            <w:tcW w:w="0" w:type="auto"/>
+            <w:tcBorders>
+              <w:top w:val="single" w:sz="6" w:space="0" w:color="auto"/>
+              <w:left w:val="single" w:sz="6" w:space="0" w:color="auto"/>
+              <w:bottom w:val="single" w:sz="6" w:space="0" w:color="auto"/>
+              <w:right w:val="single" w:sz="6" w:space="0" w:color="auto"/>
+            </w:tcBorders>
+            <w:tcMar>
+              <w:top w:w="120" w:type="dxa"/>
+              <w:left w:w="180" w:type="dxa"/>
+              <w:bottom w:w="120" w:type="dxa"/>
+              <w:right w:w="180" w:type="dxa"/>
+            </w:tcMar>
+            <w:vAlign w:val="center"/>
+            <w:hideMark/>
+          </w:tcPr>
+          <w:p>
+            <w:pPr>
+              <w:jc w:val="center"/>
+            </w:pPr>
+            <w:r>
+              <w:t>Auto</w:t>
+            </w:r>
+          </w:p>
+        </w:tc>
+        <w:tc>
+          <w:tcPr>
+            <w:tcW w:w="0" w:type="auto"/>
+            <w:tcBorders>
+              <w:top w:val="single" w:sz="6" w:space="0" w:color="auto"/>
+              <w:left w:val="single" w:sz="6" w:space="0" w:color="auto"/>
+              <w:bottom w:val="single" w:sz="6" w:space="0" w:color="auto"/>
+              <w:right w:val="single" w:sz="6" w:space="0" w:color="auto"/>
+            </w:tcBorders>
+            <w:tcMar>
+              <w:top w:w="120" w:type="dxa"/>
+              <w:left w:w="180" w:type="dxa"/>
+              <w:bottom w:w="120" w:type="dxa"/>
+              <w:right w:w="180" w:type="dxa"/>
+            </w:tcMar>
+            <w:vAlign w:val="center"/>
+            <w:hideMark/>
+          </w:tcPr>
+          <w:p>
+            <w:pPr>
+              <w:jc w:val="center"/>
+            </w:pPr>
+            <w:r>
+              <w:t>Verifica inizializzazione stato auto e percentuale carica</w:t>
+            </w:r>
+          </w:p>
+        </w:tc>
+      </w:tr>
+      <w:tr>
+        <w:trPr>
+          <w:tblCellSpacing w:w="15" w:type="dxa"/>
+        </w:trPr>
+        <w:tc>
+          <w:tcPr>
+            <w:tcW w:w="0" w:type="auto"/>
+            <w:tcBorders>
+              <w:top w:val="single" w:sz="6" w:space="0" w:color="auto"/>
+              <w:left w:val="single" w:sz="6" w:space="0" w:color="auto"/>
+              <w:bottom w:val="single" w:sz="6" w:space="0" w:color="auto"/>
+              <w:right w:val="single" w:sz="6" w:space="0" w:color="auto"/>
+            </w:tcBorders>
+            <w:tcMar>
+              <w:top w:w="120" w:type="dxa"/>
+              <w:left w:w="180" w:type="dxa"/>
+              <w:bottom w:w="120" w:type="dxa"/>
+              <w:right w:w="180" w:type="dxa"/>
+            </w:tcMar>
+            <w:vAlign w:val="center"/>
+            <w:hideMark/>
+          </w:tcPr>
+          <w:p>
+            <w:pPr>
+              <w:jc w:val="center"/>
+            </w:pPr>
+            <w:r>
+              <w:rPr>
+                <w:b/>
+                <w:bCs/>
+              </w:rPr>
+              <w:t>PrenotazioneTest</w:t>
+            </w:r>
+          </w:p>
+        </w:tc>
+        <w:tc>
+          <w:tcPr>
+            <w:tcW w:w="0" w:type="auto"/>
+            <w:tcBorders>
+              <w:top w:val="single" w:sz="6" w:space="0" w:color="auto"/>
+              <w:left w:val="single" w:sz="6" w:space="0" w:color="auto"/>
+              <w:bottom w:val="single" w:sz="6" w:space="0" w:color="auto"/>
+              <w:right w:val="single" w:sz="6" w:space="0" w:color="auto"/>
+            </w:tcBorders>
+            <w:tcMar>
+              <w:top w:w="120" w:type="dxa"/>
+              <w:left w:w="180" w:type="dxa"/>
+              <w:bottom w:w="120" w:type="dxa"/>
+              <w:right w:w="180" w:type="dxa"/>
+            </w:tcMar>
+            <w:vAlign w:val="center"/>
+            <w:hideMark/>
+          </w:tcPr>
+          <w:p>
+            <w:pPr>
+              <w:jc w:val="center"/>
+            </w:pPr>
+            <w:r>
+              <w:t>Prenotazione</w:t>
+            </w:r>
+          </w:p>
+        </w:tc>
+        <w:tc>
+          <w:tcPr>
+            <w:tcW w:w="0" w:type="auto"/>
+            <w:tcBorders>
+              <w:top w:val="single" w:sz="6" w:space="0" w:color="auto"/>
+              <w:left w:val="single" w:sz="6" w:space="0" w:color="auto"/>
+              <w:bottom w:val="single" w:sz="6" w:space="0" w:color="auto"/>
+              <w:right w:val="single" w:sz="6" w:space="0" w:color="auto"/>
+            </w:tcBorders>
+            <w:tcMar>
+              <w:top w:w="120" w:type="dxa"/>
+              <w:left w:w="180" w:type="dxa"/>
+              <w:bottom w:w="120" w:type="dxa"/>
+              <w:right w:w="180" w:type="dxa"/>
+            </w:tcMar>
+            <w:vAlign w:val="center"/>
+            <w:hideMark/>
+          </w:tcPr>
+          <w:p>
+            <w:pPr>
+              <w:jc w:val="center"/>
+            </w:pPr>
+            <w:r>
+              <w:t>Verifica corretta inziziallizazione dello stato della prenotazione</w:t>
+            </w:r>
+          </w:p>
+        </w:tc>
+      </w:tr>
+      <w:tr>
+        <w:trPr>
+          <w:tblCellSpacing w:w="15" w:type="dxa"/>
+        </w:trPr>
+        <w:tc>
+          <w:tcPr>
+            <w:tcW w:w="0" w:type="auto"/>
+            <w:tcBorders>
+              <w:top w:val="single" w:sz="6" w:space="0" w:color="auto"/>
+              <w:left w:val="single" w:sz="6" w:space="0" w:color="auto"/>
+              <w:bottom w:val="single" w:sz="6" w:space="0" w:color="auto"/>
+              <w:right w:val="single" w:sz="6" w:space="0" w:color="auto"/>
+            </w:tcBorders>
+            <w:tcMar>
+              <w:top w:w="120" w:type="dxa"/>
+              <w:left w:w="180" w:type="dxa"/>
+              <w:bottom w:w="120" w:type="dxa"/>
+              <w:right w:w="180" w:type="dxa"/>
+            </w:tcMar>
+            <w:vAlign w:val="center"/>
+            <w:hideMark/>
+          </w:tcPr>
+          <w:p>
+            <w:pPr>
+              <w:jc w:val="center"/>
+            </w:pPr>
+            <w:r>
+              <w:rPr>
+                <w:b/>
+                <w:bCs/>
+              </w:rPr>
+              <w:t>TipoAutoTest</w:t>
+            </w:r>
+          </w:p>
+        </w:tc>
+        <w:tc>
+          <w:tcPr>
+            <w:tcW w:w="0" w:type="auto"/>
+            <w:tcBorders>
+              <w:top w:val="single" w:sz="6" w:space="0" w:color="auto"/>
+              <w:left w:val="single" w:sz="6" w:space="0" w:color="auto"/>
+              <w:bottom w:val="single" w:sz="6" w:space="0" w:color="auto"/>
+              <w:right w:val="single" w:sz="6" w:space="0" w:color="auto"/>
+            </w:tcBorders>
+            <w:tcMar>
+              <w:top w:w="120" w:type="dxa"/>
+              <w:left w:w="180" w:type="dxa"/>
+              <w:bottom w:w="120" w:type="dxa"/>
+              <w:right w:w="180" w:type="dxa"/>
+            </w:tcMar>
+            <w:vAlign w:val="center"/>
+            <w:hideMark/>
+          </w:tcPr>
+          <w:p>
+            <w:pPr>
+              <w:jc w:val="center"/>
+            </w:pPr>
+            <w:r>
+              <w:t>TipoAuto (Enum)</w:t>
+            </w:r>
+          </w:p>
+        </w:tc>
+        <w:tc>
+          <w:tcPr>
+            <w:tcW w:w="0" w:type="auto"/>
+            <w:tcBorders>
+              <w:top w:val="single" w:sz="6" w:space="0" w:color="auto"/>
+              <w:left w:val="single" w:sz="6" w:space="0" w:color="auto"/>
+              <w:bottom w:val="single" w:sz="6" w:space="0" w:color="auto"/>
+              <w:right w:val="single" w:sz="6" w:space="0" w:color="auto"/>
+            </w:tcBorders>
+            <w:tcMar>
+              <w:top w:w="120" w:type="dxa"/>
+              <w:left w:w="180" w:type="dxa"/>
+              <w:bottom w:w="120" w:type="dxa"/>
+              <w:right w:w="180" w:type="dxa"/>
+            </w:tcMar>
+            <w:vAlign w:val="center"/>
+            <w:hideMark/>
+          </w:tcPr>
+          <w:p>
+            <w:pPr>
+              <w:jc w:val="center"/>
+            </w:pPr>
+            <w:r>
+              <w:t>Verifica conversione Stringa-Enumerativo anche in caso di input minuscolo/maiuscolo</w:t>
+            </w:r>
+          </w:p>
+        </w:tc>
+      </w:tr>
+      <w:tr>
+        <w:trPr>
+          <w:tblCellSpacing w:w="15" w:type="dxa"/>
+        </w:trPr>
+        <w:tc>
+          <w:tcPr>
+            <w:tcW w:w="0" w:type="auto"/>
+            <w:tcBorders>
+              <w:top w:val="single" w:sz="6" w:space="0" w:color="auto"/>
+              <w:left w:val="single" w:sz="6" w:space="0" w:color="auto"/>
+              <w:bottom w:val="single" w:sz="6" w:space="0" w:color="auto"/>
+              <w:right w:val="single" w:sz="6" w:space="0" w:color="auto"/>
+            </w:tcBorders>
+            <w:tcMar>
+              <w:top w:w="120" w:type="dxa"/>
+              <w:left w:w="180" w:type="dxa"/>
+              <w:bottom w:w="120" w:type="dxa"/>
+              <w:right w:w="180" w:type="dxa"/>
+            </w:tcMar>
+            <w:vAlign w:val="center"/>
+            <w:hideMark/>
+          </w:tcPr>
+          <w:p>
+            <w:pPr>
+              <w:jc w:val="center"/>
+            </w:pPr>
+            <w:r>
+              <w:rPr>
+                <w:b/>
+                <w:bCs/>
+              </w:rPr>
+              <w:t>QRCodeTest</w:t>
+            </w:r>
+          </w:p>
+        </w:tc>
+        <w:tc>
+          <w:tcPr>
+            <w:tcW w:w="0" w:type="auto"/>
+            <w:tcBorders>
+              <w:top w:val="single" w:sz="6" w:space="0" w:color="auto"/>
+              <w:left w:val="single" w:sz="6" w:space="0" w:color="auto"/>
+              <w:bottom w:val="single" w:sz="6" w:space="0" w:color="auto"/>
+              <w:right w:val="single" w:sz="6" w:space="0" w:color="auto"/>
+            </w:tcBorders>
+            <w:tcMar>
+              <w:top w:w="120" w:type="dxa"/>
+              <w:left w:w="180" w:type="dxa"/>
+              <w:bottom w:w="120" w:type="dxa"/>
+              <w:right w:w="180" w:type="dxa"/>
+            </w:tcMar>
+            <w:vAlign w:val="center"/>
+            <w:hideMark/>
+          </w:tcPr>
+          <w:p>
+            <w:pPr>
+              <w:jc w:val="center"/>
+            </w:pPr>
+            <w:r>
+              <w:t>QRCode</w:t>
+            </w:r>
+          </w:p>
+        </w:tc>
+        <w:tc>
+          <w:tcPr>
+            <w:tcW w:w="0" w:type="auto"/>
+            <w:tcBorders>
+              <w:top w:val="single" w:sz="6" w:space="0" w:color="auto"/>
+              <w:left w:val="single" w:sz="6" w:space="0" w:color="auto"/>
+              <w:bottom w:val="single" w:sz="6" w:space="0" w:color="auto"/>
+              <w:right w:val="single" w:sz="6" w:space="0" w:color="auto"/>
+            </w:tcBorders>
+            <w:tcMar>
+              <w:top w:w="120" w:type="dxa"/>
+              <w:left w:w="180" w:type="dxa"/>
+              <w:bottom w:w="120" w:type="dxa"/>
+              <w:right w:w="180" w:type="dxa"/>
+            </w:tcMar>
+            <w:vAlign w:val="center"/>
+            <w:hideMark/>
+          </w:tcPr>
+          <w:p>
+            <w:pPr>
+              <w:jc w:val="center"/>
+            </w:pPr>
+            <w:r>
+              <w:t>Verifica generazione QR code corretta senza eccezioni</w:t>
+            </w:r>
+          </w:p>
+        </w:tc>
+      </w:tr>
+    </w:tbl>
+    <w:p>
+      <w:pPr>
+        <w:jc w:val="center"/>
+      </w:pPr>
+    </w:p>
+    <w:p>
+      <w:pPr>
+        <w:jc w:val="center"/>
+      </w:pPr>
+    </w:p>
+    <w:p>
+      <w:pPr>
+        <w:jc w:val="center"/>
+      </w:pPr>
+    </w:p>
+    <w:p>
+      <w:pPr>
+        <w:jc w:val="center"/>
+      </w:pPr>
+    </w:p>
+    <w:p>
+      <w:pPr>
+        <w:jc w:val="center"/>
+      </w:pPr>
+    </w:p>
+    <w:p>
+      <w:pPr>
+        <w:jc w:val="center"/>
+      </w:pPr>
+    </w:p>
+    <w:p>
+      <w:pPr>
+        <w:jc w:val="center"/>
+      </w:pPr>
+    </w:p>
+    <w:p>
+      <w:pPr>
+        <w:rPr>
+          <w:i/>
+          <w:iCs/>
+          <w:u w:val="single"/>
+        </w:rPr>
+      </w:pPr>
+      <w:r>
+        <w:rPr>
+          <w:i/>
+          <w:iCs/>
+          <w:u w:val="single"/>
+        </w:rPr>
+        <w:lastRenderedPageBreak/>
+        <w:t>Code Coverage</w:t>
+      </w:r>
+    </w:p>
+    <w:p>
+      <w:r>
+        <w:t>È stata effettuata un’analisi della copertura utilizzando EclEmma.</w:t>
+      </w:r>
+    </w:p>
+    <w:p>
+      <w:r>
+        <w:t>Qui la percentuale di istruzioni verificata dai test per le classi analizzate.</w:t>
+      </w:r>
+    </w:p>
+    <w:p>
+      <w:pPr>
+        <w:jc w:val="center"/>
+      </w:pPr>
+    </w:p>
+    <w:tbl>
+      <w:tblPr>
+        <w:tblW w:w="0" w:type="auto"/>
+        <w:tblCellSpacing w:w="15" w:type="dxa"/>
+        <w:tblCellMar>
+          <w:left w:w="0" w:type="dxa"/>
+          <w:right w:w="0" w:type="dxa"/>
+        </w:tblCellMar>
+        <w:tblLook w:val="04A0" w:firstRow="1" w:lastRow="0" w:firstColumn="1" w:lastColumn="0" w:noHBand="0" w:noVBand="1"/>
+      </w:tblPr>
+      <w:tblGrid>
+        <w:gridCol w:w="1693"/>
+        <w:gridCol w:w="1791"/>
+        <w:gridCol w:w="6138"/>
+      </w:tblGrid>
+      <w:tr>
+        <w:trPr>
+          <w:tblHeader/>
+          <w:tblCellSpacing w:w="15" w:type="dxa"/>
+        </w:trPr>
+        <w:tc>
+          <w:tcPr>
+            <w:tcW w:w="0" w:type="auto"/>
+            <w:tcBorders>
+              <w:top w:val="single" w:sz="6" w:space="0" w:color="auto"/>
+              <w:left w:val="single" w:sz="6" w:space="0" w:color="auto"/>
+              <w:bottom w:val="single" w:sz="6" w:space="0" w:color="auto"/>
+              <w:right w:val="single" w:sz="6" w:space="0" w:color="auto"/>
+            </w:tcBorders>
+            <w:tcMar>
+              <w:top w:w="120" w:type="dxa"/>
+              <w:left w:w="180" w:type="dxa"/>
+              <w:bottom w:w="120" w:type="dxa"/>
+              <w:right w:w="180" w:type="dxa"/>
+            </w:tcMar>
+            <w:vAlign w:val="center"/>
+            <w:hideMark/>
+          </w:tcPr>
+          <w:p>
+            <w:pPr>
+              <w:jc w:val="center"/>
+            </w:pPr>
+            <w:r>
+              <w:rPr>
+                <w:b/>
+                <w:bCs/>
+              </w:rPr>
+              <w:t>Classe Critica</w:t>
+            </w:r>
+          </w:p>
+        </w:tc>
+        <w:tc>
+          <w:tcPr>
+            <w:tcW w:w="1770" w:type="dxa"/>
+            <w:tcBorders>
+              <w:top w:val="single" w:sz="6" w:space="0" w:color="auto"/>
+              <w:left w:val="single" w:sz="6" w:space="0" w:color="auto"/>
+              <w:bottom w:val="single" w:sz="6" w:space="0" w:color="auto"/>
+              <w:right w:val="single" w:sz="6" w:space="0" w:color="auto"/>
+            </w:tcBorders>
+            <w:tcMar>
+              <w:top w:w="120" w:type="dxa"/>
+              <w:left w:w="180" w:type="dxa"/>
+              <w:bottom w:w="120" w:type="dxa"/>
+              <w:right w:w="180" w:type="dxa"/>
+            </w:tcMar>
+            <w:vAlign w:val="center"/>
+            <w:hideMark/>
+          </w:tcPr>
+          <w:p>
+            <w:pPr>
+              <w:jc w:val="center"/>
+            </w:pPr>
+            <w:r>
+              <w:rPr>
+                <w:b/>
+                <w:bCs/>
+              </w:rPr>
+              <w:t>Copertu</w:t>
+            </w:r>
+            <w:r>
+              <w:rPr>
+                <w:b/>
+                <w:bCs/>
+              </w:rPr>
+              <w:t>ra</w:t>
+            </w:r>
+          </w:p>
+        </w:tc>
+        <w:tc>
+          <w:tcPr>
+            <w:tcW w:w="6183" w:type="dxa"/>
+            <w:tcBorders>
+              <w:top w:val="single" w:sz="6" w:space="0" w:color="auto"/>
+              <w:left w:val="single" w:sz="6" w:space="0" w:color="auto"/>
+              <w:bottom w:val="single" w:sz="6" w:space="0" w:color="auto"/>
+              <w:right w:val="single" w:sz="6" w:space="0" w:color="auto"/>
+            </w:tcBorders>
+            <w:tcMar>
+              <w:top w:w="120" w:type="dxa"/>
+              <w:left w:w="180" w:type="dxa"/>
+              <w:bottom w:w="120" w:type="dxa"/>
+              <w:right w:w="180" w:type="dxa"/>
+            </w:tcMar>
+            <w:vAlign w:val="center"/>
+            <w:hideMark/>
+          </w:tcPr>
+          <w:p>
+            <w:pPr>
+              <w:jc w:val="center"/>
+            </w:pPr>
+            <w:r>
+              <w:t>Percentuale Eclemma</w:t>
+            </w:r>
+          </w:p>
+        </w:tc>
+      </w:tr>
+      <w:tr>
+        <w:trPr>
+          <w:tblCellSpacing w:w="15" w:type="dxa"/>
+        </w:trPr>
+        <w:tc>
+          <w:tcPr>
+            <w:tcW w:w="0" w:type="auto"/>
+            <w:tcBorders>
+              <w:top w:val="single" w:sz="6" w:space="0" w:color="auto"/>
+              <w:left w:val="single" w:sz="6" w:space="0" w:color="auto"/>
+              <w:bottom w:val="single" w:sz="6" w:space="0" w:color="auto"/>
+              <w:right w:val="single" w:sz="6" w:space="0" w:color="auto"/>
+            </w:tcBorders>
+            <w:tcMar>
+              <w:top w:w="120" w:type="dxa"/>
+              <w:left w:w="180" w:type="dxa"/>
+              <w:bottom w:w="120" w:type="dxa"/>
+              <w:right w:w="180" w:type="dxa"/>
+            </w:tcMar>
+            <w:vAlign w:val="center"/>
+            <w:hideMark/>
+          </w:tcPr>
+          <w:p>
+            <w:pPr>
+              <w:jc w:val="center"/>
+            </w:pPr>
+            <w:r>
+              <w:rPr>
+                <w:b/>
+                <w:bCs/>
+              </w:rPr>
+              <w:t>DataValidator</w:t>
+            </w:r>
+          </w:p>
+        </w:tc>
+        <w:tc>
+          <w:tcPr>
+            <w:tcW w:w="1770" w:type="dxa"/>
+            <w:tcBorders>
+              <w:top w:val="single" w:sz="6" w:space="0" w:color="auto"/>
+              <w:left w:val="single" w:sz="6" w:space="0" w:color="auto"/>
+              <w:bottom w:val="single" w:sz="6" w:space="0" w:color="auto"/>
+              <w:right w:val="single" w:sz="6" w:space="0" w:color="auto"/>
+            </w:tcBorders>
+            <w:tcMar>
+              <w:top w:w="120" w:type="dxa"/>
+              <w:left w:w="180" w:type="dxa"/>
+              <w:bottom w:w="120" w:type="dxa"/>
+              <w:right w:w="180" w:type="dxa"/>
+            </w:tcMar>
+            <w:vAlign w:val="center"/>
+            <w:hideMark/>
+          </w:tcPr>
+          <w:p>
+            <w:pPr>
+              <w:jc w:val="center"/>
+            </w:pPr>
+            <w:r>
+              <w:t>%</w:t>
+            </w:r>
+          </w:p>
+        </w:tc>
+        <w:tc>
+          <w:tcPr>
+            <w:tcW w:w="6183" w:type="dxa"/>
+            <w:tcBorders>
+              <w:top w:val="single" w:sz="6" w:space="0" w:color="auto"/>
+              <w:left w:val="single" w:sz="6" w:space="0" w:color="auto"/>
+              <w:bottom w:val="single" w:sz="6" w:space="0" w:color="auto"/>
+              <w:right w:val="single" w:sz="6" w:space="0" w:color="auto"/>
+            </w:tcBorders>
+            <w:tcMar>
+              <w:top w:w="120" w:type="dxa"/>
+              <w:left w:w="180" w:type="dxa"/>
+              <w:bottom w:w="120" w:type="dxa"/>
+              <w:right w:w="180" w:type="dxa"/>
+            </w:tcMar>
+            <w:vAlign w:val="center"/>
+            <w:hideMark/>
+          </w:tcPr>
+          <w:p>
+            <w:pPr>
+              <w:jc w:val="center"/>
+            </w:pPr>
+            <w:r>
+              <w:t>Screen Eclemma</w:t>
+            </w:r>
+          </w:p>
+        </w:tc>
+      </w:tr>
+      <w:tr>
+        <w:trPr>
+          <w:tblCellSpacing w:w="15" w:type="dxa"/>
+        </w:trPr>
+        <w:tc>
+          <w:tcPr>
+            <w:tcW w:w="0" w:type="auto"/>
+            <w:tcBorders>
+              <w:top w:val="single" w:sz="6" w:space="0" w:color="auto"/>
+              <w:left w:val="single" w:sz="6" w:space="0" w:color="auto"/>
+              <w:bottom w:val="single" w:sz="6" w:space="0" w:color="auto"/>
+              <w:right w:val="single" w:sz="6" w:space="0" w:color="auto"/>
+            </w:tcBorders>
+            <w:tcMar>
+              <w:top w:w="120" w:type="dxa"/>
+              <w:left w:w="180" w:type="dxa"/>
+              <w:bottom w:w="120" w:type="dxa"/>
+              <w:right w:w="180" w:type="dxa"/>
+            </w:tcMar>
+            <w:vAlign w:val="center"/>
+            <w:hideMark/>
+          </w:tcPr>
+          <w:p>
+            <w:pPr>
+              <w:jc w:val="center"/>
+            </w:pPr>
+            <w:r>
+              <w:rPr>
+                <w:b/>
+                <w:bCs/>
+              </w:rPr>
+              <w:t>Auto</w:t>
+            </w:r>
+          </w:p>
+        </w:tc>
+        <w:tc>
+          <w:tcPr>
+            <w:tcW w:w="1770" w:type="dxa"/>
+            <w:tcBorders>
+              <w:top w:val="single" w:sz="6" w:space="0" w:color="auto"/>
+              <w:left w:val="single" w:sz="6" w:space="0" w:color="auto"/>
+              <w:bottom w:val="single" w:sz="6" w:space="0" w:color="auto"/>
+              <w:right w:val="single" w:sz="6" w:space="0" w:color="auto"/>
+            </w:tcBorders>
+            <w:tcMar>
+              <w:top w:w="120" w:type="dxa"/>
+              <w:left w:w="180" w:type="dxa"/>
+              <w:bottom w:w="120" w:type="dxa"/>
+              <w:right w:w="180" w:type="dxa"/>
+            </w:tcMar>
+            <w:vAlign w:val="center"/>
+            <w:hideMark/>
+          </w:tcPr>
+          <w:p>
+            <w:pPr>
+              <w:jc w:val="center"/>
+            </w:pPr>
+          </w:p>
+        </w:tc>
+        <w:tc>
+          <w:tcPr>
+            <w:tcW w:w="6183" w:type="dxa"/>
+            <w:tcBorders>
+              <w:top w:val="single" w:sz="6" w:space="0" w:color="auto"/>
+              <w:left w:val="single" w:sz="6" w:space="0" w:color="auto"/>
+              <w:bottom w:val="single" w:sz="6" w:space="0" w:color="auto"/>
+              <w:right w:val="single" w:sz="6" w:space="0" w:color="auto"/>
+            </w:tcBorders>
+            <w:tcMar>
+              <w:top w:w="120" w:type="dxa"/>
+              <w:left w:w="180" w:type="dxa"/>
+              <w:bottom w:w="120" w:type="dxa"/>
+              <w:right w:w="180" w:type="dxa"/>
+            </w:tcMar>
+            <w:vAlign w:val="center"/>
+            <w:hideMark/>
+          </w:tcPr>
+          <w:p>
+            <w:pPr>
+              <w:jc w:val="center"/>
+            </w:pPr>
+          </w:p>
+        </w:tc>
+      </w:tr>
+      <w:tr>
+        <w:trPr>
+          <w:tblCellSpacing w:w="15" w:type="dxa"/>
+        </w:trPr>
+        <w:tc>
+          <w:tcPr>
+            <w:tcW w:w="0" w:type="auto"/>
+            <w:tcBorders>
+              <w:top w:val="single" w:sz="6" w:space="0" w:color="auto"/>
+              <w:left w:val="single" w:sz="6" w:space="0" w:color="auto"/>
+              <w:bottom w:val="single" w:sz="6" w:space="0" w:color="auto"/>
+              <w:right w:val="single" w:sz="6" w:space="0" w:color="auto"/>
+            </w:tcBorders>
+            <w:tcMar>
+              <w:top w:w="120" w:type="dxa"/>
+              <w:left w:w="180" w:type="dxa"/>
+              <w:bottom w:w="120" w:type="dxa"/>
+              <w:right w:w="180" w:type="dxa"/>
+            </w:tcMar>
+            <w:vAlign w:val="center"/>
+            <w:hideMark/>
+          </w:tcPr>
+          <w:p>
+            <w:pPr>
+              <w:jc w:val="center"/>
+            </w:pPr>
+            <w:r>
+              <w:rPr>
+                <w:b/>
+                <w:bCs/>
+              </w:rPr>
+              <w:t>Prenotazione</w:t>
+            </w:r>
+          </w:p>
+        </w:tc>
+        <w:tc>
+          <w:tcPr>
+            <w:tcW w:w="1770" w:type="dxa"/>
+            <w:tcBorders>
+              <w:top w:val="single" w:sz="6" w:space="0" w:color="auto"/>
+              <w:left w:val="single" w:sz="6" w:space="0" w:color="auto"/>
+              <w:bottom w:val="single" w:sz="6" w:space="0" w:color="auto"/>
+              <w:right w:val="single" w:sz="6" w:space="0" w:color="auto"/>
+            </w:tcBorders>
+            <w:tcMar>
+              <w:top w:w="120" w:type="dxa"/>
+              <w:left w:w="180" w:type="dxa"/>
+              <w:bottom w:w="120" w:type="dxa"/>
+              <w:right w:w="180" w:type="dxa"/>
+            </w:tcMar>
+            <w:vAlign w:val="center"/>
+            <w:hideMark/>
+          </w:tcPr>
+          <w:p>
+            <w:pPr>
+              <w:jc w:val="center"/>
+            </w:pPr>
+          </w:p>
+        </w:tc>
+        <w:tc>
+          <w:tcPr>
+            <w:tcW w:w="6183" w:type="dxa"/>
+            <w:tcBorders>
+              <w:top w:val="single" w:sz="6" w:space="0" w:color="auto"/>
+              <w:left w:val="single" w:sz="6" w:space="0" w:color="auto"/>
+              <w:bottom w:val="single" w:sz="6" w:space="0" w:color="auto"/>
+              <w:right w:val="single" w:sz="6" w:space="0" w:color="auto"/>
+            </w:tcBorders>
+            <w:tcMar>
+              <w:top w:w="120" w:type="dxa"/>
+              <w:left w:w="180" w:type="dxa"/>
+              <w:bottom w:w="120" w:type="dxa"/>
+              <w:right w:w="180" w:type="dxa"/>
+            </w:tcMar>
+            <w:vAlign w:val="center"/>
+            <w:hideMark/>
+          </w:tcPr>
+          <w:p>
+            <w:pPr>
+              <w:jc w:val="center"/>
+            </w:pPr>
+          </w:p>
+        </w:tc>
+      </w:tr>
+      <w:tr>
+        <w:trPr>
+          <w:tblCellSpacing w:w="15" w:type="dxa"/>
+        </w:trPr>
+        <w:tc>
+          <w:tcPr>
+            <w:tcW w:w="0" w:type="auto"/>
+            <w:tcBorders>
+              <w:top w:val="single" w:sz="6" w:space="0" w:color="auto"/>
+              <w:left w:val="single" w:sz="6" w:space="0" w:color="auto"/>
+              <w:bottom w:val="single" w:sz="6" w:space="0" w:color="auto"/>
+              <w:right w:val="single" w:sz="6" w:space="0" w:color="auto"/>
+            </w:tcBorders>
+            <w:tcMar>
+              <w:top w:w="120" w:type="dxa"/>
+              <w:left w:w="180" w:type="dxa"/>
+              <w:bottom w:w="120" w:type="dxa"/>
+              <w:right w:w="180" w:type="dxa"/>
+            </w:tcMar>
+            <w:vAlign w:val="center"/>
+            <w:hideMark/>
+          </w:tcPr>
+          <w:p>
+            <w:pPr>
+              <w:jc w:val="center"/>
+            </w:pPr>
+            <w:r>
+              <w:rPr>
+                <w:b/>
+                <w:bCs/>
+              </w:rPr>
+              <w:t>TipoAuto</w:t>
+            </w:r>
+          </w:p>
+        </w:tc>
+        <w:tc>
+          <w:tcPr>
+            <w:tcW w:w="1770" w:type="dxa"/>
+            <w:tcBorders>
+              <w:top w:val="single" w:sz="6" w:space="0" w:color="auto"/>
+              <w:left w:val="single" w:sz="6" w:space="0" w:color="auto"/>
+              <w:bottom w:val="single" w:sz="6" w:space="0" w:color="auto"/>
+              <w:right w:val="single" w:sz="6" w:space="0" w:color="auto"/>
+            </w:tcBorders>
+            <w:tcMar>
+              <w:top w:w="120" w:type="dxa"/>
+              <w:left w:w="180" w:type="dxa"/>
+              <w:bottom w:w="120" w:type="dxa"/>
+              <w:right w:w="180" w:type="dxa"/>
+            </w:tcMar>
+            <w:vAlign w:val="center"/>
+            <w:hideMark/>
+          </w:tcPr>
+          <w:p>
+            <w:pPr>
+              <w:jc w:val="center"/>
+            </w:pPr>
+          </w:p>
+        </w:tc>
+        <w:tc>
+          <w:tcPr>
+            <w:tcW w:w="6183" w:type="dxa"/>
+            <w:tcBorders>
+              <w:top w:val="single" w:sz="6" w:space="0" w:color="auto"/>
+              <w:left w:val="single" w:sz="6" w:space="0" w:color="auto"/>
+              <w:bottom w:val="single" w:sz="6" w:space="0" w:color="auto"/>
+              <w:right w:val="single" w:sz="6" w:space="0" w:color="auto"/>
+            </w:tcBorders>
+            <w:tcMar>
+              <w:top w:w="120" w:type="dxa"/>
+              <w:left w:w="180" w:type="dxa"/>
+              <w:bottom w:w="120" w:type="dxa"/>
+              <w:right w:w="180" w:type="dxa"/>
+            </w:tcMar>
+            <w:vAlign w:val="center"/>
+            <w:hideMark/>
+          </w:tcPr>
+          <w:p>
+            <w:pPr>
+              <w:jc w:val="center"/>
+            </w:pPr>
+          </w:p>
+        </w:tc>
+      </w:tr>
+      <w:tr>
+        <w:trPr>
+          <w:tblCellSpacing w:w="15" w:type="dxa"/>
+        </w:trPr>
+        <w:tc>
+          <w:tcPr>
+            <w:tcW w:w="0" w:type="auto"/>
+            <w:tcBorders>
+              <w:top w:val="single" w:sz="6" w:space="0" w:color="auto"/>
+              <w:left w:val="single" w:sz="6" w:space="0" w:color="auto"/>
+              <w:bottom w:val="single" w:sz="6" w:space="0" w:color="auto"/>
+              <w:right w:val="single" w:sz="6" w:space="0" w:color="auto"/>
+            </w:tcBorders>
+            <w:tcMar>
+              <w:top w:w="120" w:type="dxa"/>
+              <w:left w:w="180" w:type="dxa"/>
+              <w:bottom w:w="120" w:type="dxa"/>
+              <w:right w:w="180" w:type="dxa"/>
+            </w:tcMar>
+            <w:vAlign w:val="center"/>
+            <w:hideMark/>
+          </w:tcPr>
+          <w:p>
+            <w:pPr>
+              <w:jc w:val="center"/>
+            </w:pPr>
+            <w:r>
+              <w:rPr>
+                <w:b/>
+                <w:bCs/>
+              </w:rPr>
+              <w:t>QRCode</w:t>
+            </w:r>
+          </w:p>
+        </w:tc>
+        <w:tc>
+          <w:tcPr>
+            <w:tcW w:w="1770" w:type="dxa"/>
+            <w:tcBorders>
+              <w:top w:val="single" w:sz="6" w:space="0" w:color="auto"/>
+              <w:left w:val="single" w:sz="6" w:space="0" w:color="auto"/>
+              <w:bottom w:val="single" w:sz="6" w:space="0" w:color="auto"/>
+              <w:right w:val="single" w:sz="6" w:space="0" w:color="auto"/>
+            </w:tcBorders>
+            <w:tcMar>
+              <w:top w:w="120" w:type="dxa"/>
+              <w:left w:w="180" w:type="dxa"/>
+              <w:bottom w:w="120" w:type="dxa"/>
+              <w:right w:w="180" w:type="dxa"/>
+            </w:tcMar>
+            <w:vAlign w:val="center"/>
+            <w:hideMark/>
+          </w:tcPr>
+          <w:p>
+            <w:pPr>
+              <w:jc w:val="center"/>
+            </w:pPr>
+          </w:p>
+        </w:tc>
+        <w:tc>
+          <w:tcPr>
+            <w:tcW w:w="6183" w:type="dxa"/>
+            <w:tcBorders>
+              <w:top w:val="single" w:sz="6" w:space="0" w:color="auto"/>
+              <w:left w:val="single" w:sz="6" w:space="0" w:color="auto"/>
+              <w:bottom w:val="single" w:sz="6" w:space="0" w:color="auto"/>
+              <w:right w:val="single" w:sz="6" w:space="0" w:color="auto"/>
+            </w:tcBorders>
+            <w:tcMar>
+              <w:top w:w="120" w:type="dxa"/>
+              <w:left w:w="180" w:type="dxa"/>
+              <w:bottom w:w="120" w:type="dxa"/>
+              <w:right w:w="180" w:type="dxa"/>
+            </w:tcMar>
+            <w:vAlign w:val="center"/>
+            <w:hideMark/>
+          </w:tcPr>
+          <w:p>
+            <w:pPr>
+              <w:jc w:val="center"/>
+            </w:pPr>
+          </w:p>
+        </w:tc>
+      </w:tr>
+    </w:tbl>
+    <w:p>
+      <w:pPr>
+        <w:jc w:val="center"/>
+      </w:pPr>
+    </w:p>
     <w:sectPr>
       <w:pgSz w:w="11906" w:h="16838"/>
       <w:pgMar w:top="1417" w:right="1134" w:bottom="1134" w:left="1134" w:header="708" w:footer="708" w:gutter="0"/>
@@ -43,6 +1306,177 @@
     </w:sectPr>
   </w:body>
 </w:document>
+</file>
+
+<file path=word/endnotes.xml><?xml version="1.0" encoding="utf-8"?>
+<w:endnotes xmlns:wpc="http://schemas.microsoft.com/office/word/2010/wordprocessingCanvas" xmlns:cx="http://schemas.microsoft.com/office/drawing/2014/chartex" xmlns:cx1="http://schemas.microsoft.com/office/drawing/2015/9/8/chartex" xmlns:cx2="http://schemas.microsoft.com/office/drawing/2015/10/21/chartex" xmlns:cx3="http://schemas.microsoft.com/office/drawing/2016/5/9/chartex" xmlns:cx4="http://schemas.microsoft.com/office/drawing/2016/5/10/chartex" xmlns:cx5="http://schemas.microsoft.com/office/drawing/2016/5/11/chartex" xmlns:cx6="http://schemas.microsoft.com/office/drawing/2016/5/12/chartex" xmlns:cx7="http://schemas.microsoft.com/office/drawing/2016/5/13/chartex" xmlns:cx8="http://schemas.microsoft.com/office/drawing/2016/5/14/chartex" xmlns:mc="http://schemas.openxmlformats.org/markup-compatibility/2006" xmlns:aink="http://schemas.microsoft.com/office/drawing/2016/ink" xmlns:am3d="http://schemas.microsoft.com/office/drawing/2017/model3d" xmlns:o="urn:schemas-microsoft-com:office:office" xmlns:oel="http://schemas.microsoft.com/office/2019/extlst" xmlns:r="http://schemas.openxmlformats.org/officeDocument/2006/relationships" xmlns:m="http://schemas.openxmlformats.org/officeDocument/2006/math" xmlns:v="urn:schemas-microsoft-com:vml" xmlns:wp14="http://schemas.microsoft.com/office/word/2010/wordprocessingDrawing" xmlns:wp="http://schemas.openxmlformats.org/drawingml/2006/wordprocessingDrawing" xmlns:w10="urn:schemas-microsoft-com:office:word" xmlns:w="http://schemas.openxmlformats.org/wordprocessingml/2006/main" xmlns:w14="http://schemas.microsoft.com/office/word/2010/wordml" xmlns:w15="http://schemas.microsoft.com/office/word/2012/wordml" xmlns:w16cex="http://schemas.microsoft.com/office/word/2018/wordml/cex" xmlns:w16cid="http://schemas.microsoft.com/office/word/2016/wordml/cid" xmlns:w16="http://schemas.microsoft.com/office/word/2018/wordml" xmlns:w16du="http://schemas.microsoft.com/office/word/2023/wordml/word16du" xmlns:w16sdtdh="http://schemas.microsoft.com/office/word/2020/wordml/sdtdatahash" xmlns:w16sdtfl="http://schemas.microsoft.com/office/word/2024/wordml/sdtformatlock" xmlns:w16se="http://schemas.microsoft.com/office/word/2015/wordml/symex" xmlns:wpg="http://schemas.microsoft.com/office/word/2010/wordprocessingGroup" xmlns:wpi="http://schemas.microsoft.com/office/word/2010/wordprocessingInk" xmlns:wne="http://schemas.microsoft.com/office/word/2006/wordml" xmlns:wps="http://schemas.microsoft.com/office/word/2010/wordprocessingShape" mc:Ignorable="w14 w15 w16se w16cid w16 w16cex w16sdtdh w16sdtfl w16du wp14">
+  <w:endnote w:type="separator" w:id="-1">
+    <w:p>
+      <w:pPr>
+        <w:spacing w:after="0" w:line="240" w:lineRule="auto"/>
+      </w:pPr>
+      <w:r>
+        <w:separator/>
+      </w:r>
+    </w:p>
+  </w:endnote>
+  <w:endnote w:type="continuationSeparator" w:id="0">
+    <w:p>
+      <w:pPr>
+        <w:spacing w:after="0" w:line="240" w:lineRule="auto"/>
+      </w:pPr>
+      <w:r>
+        <w:continuationSeparator/>
+      </w:r>
+    </w:p>
+  </w:endnote>
+</w:endnotes>
+</file>
+
+<file path=word/footnotes.xml><?xml version="1.0" encoding="utf-8"?>
+<w:footnotes xmlns:wpc="http://schemas.microsoft.com/office/word/2010/wordprocessingCanvas" xmlns:cx="http://schemas.microsoft.com/office/drawing/2014/chartex" xmlns:cx1="http://schemas.microsoft.com/office/drawing/2015/9/8/chartex" xmlns:cx2="http://schemas.microsoft.com/office/drawing/2015/10/21/chartex" xmlns:cx3="http://schemas.microsoft.com/office/drawing/2016/5/9/chartex" xmlns:cx4="http://schemas.microsoft.com/office/drawing/2016/5/10/chartex" xmlns:cx5="http://schemas.microsoft.com/office/drawing/2016/5/11/chartex" xmlns:cx6="http://schemas.microsoft.com/office/drawing/2016/5/12/chartex" xmlns:cx7="http://schemas.microsoft.com/office/drawing/2016/5/13/chartex" xmlns:cx8="http://schemas.microsoft.com/office/drawing/2016/5/14/chartex" xmlns:mc="http://schemas.openxmlformats.org/markup-compatibility/2006" xmlns:aink="http://schemas.microsoft.com/office/drawing/2016/ink" xmlns:am3d="http://schemas.microsoft.com/office/drawing/2017/model3d" xmlns:o="urn:schemas-microsoft-com:office:office" xmlns:oel="http://schemas.microsoft.com/office/2019/extlst" xmlns:r="http://schemas.openxmlformats.org/officeDocument/2006/relationships" xmlns:m="http://schemas.openxmlformats.org/officeDocument/2006/math" xmlns:v="urn:schemas-microsoft-com:vml" xmlns:wp14="http://schemas.microsoft.com/office/word/2010/wordprocessingDrawing" xmlns:wp="http://schemas.openxmlformats.org/drawingml/2006/wordprocessingDrawing" xmlns:w10="urn:schemas-microsoft-com:office:word" xmlns:w="http://schemas.openxmlformats.org/wordprocessingml/2006/main" xmlns:w14="http://schemas.microsoft.com/office/word/2010/wordml" xmlns:w15="http://schemas.microsoft.com/office/word/2012/wordml" xmlns:w16cex="http://schemas.microsoft.com/office/word/2018/wordml/cex" xmlns:w16cid="http://schemas.microsoft.com/office/word/2016/wordml/cid" xmlns:w16="http://schemas.microsoft.com/office/word/2018/wordml" xmlns:w16du="http://schemas.microsoft.com/office/word/2023/wordml/word16du" xmlns:w16sdtdh="http://schemas.microsoft.com/office/word/2020/wordml/sdtdatahash" xmlns:w16sdtfl="http://schemas.microsoft.com/office/word/2024/wordml/sdtformatlock" xmlns:w16se="http://schemas.microsoft.com/office/word/2015/wordml/symex" xmlns:wpg="http://schemas.microsoft.com/office/word/2010/wordprocessingGroup" xmlns:wpi="http://schemas.microsoft.com/office/word/2010/wordprocessingInk" xmlns:wne="http://schemas.microsoft.com/office/word/2006/wordml" xmlns:wps="http://schemas.microsoft.com/office/word/2010/wordprocessingShape" mc:Ignorable="w14 w15 w16se w16cid w16 w16cex w16sdtdh w16sdtfl w16du wp14">
+  <w:footnote w:type="separator" w:id="-1">
+    <w:p>
+      <w:pPr>
+        <w:spacing w:after="0" w:line="240" w:lineRule="auto"/>
+      </w:pPr>
+      <w:r>
+        <w:separator/>
+      </w:r>
+    </w:p>
+  </w:footnote>
+  <w:footnote w:type="continuationSeparator" w:id="0">
+    <w:p>
+      <w:pPr>
+        <w:spacing w:after="0" w:line="240" w:lineRule="auto"/>
+      </w:pPr>
+      <w:r>
+        <w:continuationSeparator/>
+      </w:r>
+    </w:p>
+  </w:footnote>
+</w:footnotes>
+</file>
+
+<file path=word/numbering.xml><?xml version="1.0" encoding="utf-8"?>
+<w:numbering xmlns:wpc="http://schemas.microsoft.com/office/word/2010/wordprocessingCanvas" xmlns:cx="http://schemas.microsoft.com/office/drawing/2014/chartex" xmlns:cx1="http://schemas.microsoft.com/office/drawing/2015/9/8/chartex" xmlns:cx2="http://schemas.microsoft.com/office/drawing/2015/10/21/chartex" xmlns:cx3="http://schemas.microsoft.com/office/drawing/2016/5/9/chartex" xmlns:cx4="http://schemas.microsoft.com/office/drawing/2016/5/10/chartex" xmlns:cx5="http://schemas.microsoft.com/office/drawing/2016/5/11/chartex" xmlns:cx6="http://schemas.microsoft.com/office/drawing/2016/5/12/chartex" xmlns:cx7="http://schemas.microsoft.com/office/drawing/2016/5/13/chartex" xmlns:cx8="http://schemas.microsoft.com/office/drawing/2016/5/14/chartex" xmlns:mc="http://schemas.openxmlformats.org/markup-compatibility/2006" xmlns:aink="http://schemas.microsoft.com/office/drawing/2016/ink" xmlns:am3d="http://schemas.microsoft.com/office/drawing/2017/model3d" xmlns:o="urn:schemas-microsoft-com:office:office" xmlns:oel="http://schemas.microsoft.com/office/2019/extlst" xmlns:r="http://schemas.openxmlformats.org/officeDocument/2006/relationships" xmlns:m="http://schemas.openxmlformats.org/officeDocument/2006/math" xmlns:v="urn:schemas-microsoft-com:vml" xmlns:wp14="http://schemas.microsoft.com/office/word/2010/wordprocessingDrawing" xmlns:wp="http://schemas.openxmlformats.org/drawingml/2006/wordprocessingDrawing" xmlns:w10="urn:schemas-microsoft-com:office:word" xmlns:w="http://schemas.openxmlformats.org/wordprocessingml/2006/main" xmlns:w14="http://schemas.microsoft.com/office/word/2010/wordml" xmlns:w15="http://schemas.microsoft.com/office/word/2012/wordml" xmlns:w16cex="http://schemas.microsoft.com/office/word/2018/wordml/cex" xmlns:w16cid="http://schemas.microsoft.com/office/word/2016/wordml/cid" xmlns:w16="http://schemas.microsoft.com/office/word/2018/wordml" xmlns:w16du="http://schemas.microsoft.com/office/word/2023/wordml/word16du" xmlns:w16sdtdh="http://schemas.microsoft.com/office/word/2020/wordml/sdtdatahash" xmlns:w16sdtfl="http://schemas.microsoft.com/office/word/2024/wordml/sdtformatlock" xmlns:w16se="http://schemas.microsoft.com/office/word/2015/wordml/symex" xmlns:wpg="http://schemas.microsoft.com/office/word/2010/wordprocessingGroup" xmlns:wpi="http://schemas.microsoft.com/office/word/2010/wordprocessingInk" xmlns:wne="http://schemas.microsoft.com/office/word/2006/wordml" xmlns:wps="http://schemas.microsoft.com/office/word/2010/wordprocessingShape" mc:Ignorable="w14 w15 w16se w16cid w16 w16cex w16sdtdh w16sdtfl w16du wp14">
+  <w:abstractNum w:abstractNumId="0" w15:restartNumberingAfterBreak="0">
+    <w:nsid w:val="4AB7057C"/>
+    <w:multiLevelType w:val="hybridMultilevel"/>
+    <w:tmpl w:val="1EA60ACE"/>
+    <w:lvl w:ilvl="0" w:tplc="04100001">
+      <w:start w:val="1"/>
+      <w:numFmt w:val="bullet"/>
+      <w:lvlText w:val=""/>
+      <w:lvlJc w:val="left"/>
+      <w:pPr>
+        <w:ind w:left="720" w:hanging="360"/>
+      </w:pPr>
+      <w:rPr>
+        <w:rFonts w:ascii="Symbol" w:hAnsi="Symbol" w:hint="default"/>
+      </w:rPr>
+    </w:lvl>
+    <w:lvl w:ilvl="1" w:tplc="04100003" w:tentative="1">
+      <w:start w:val="1"/>
+      <w:numFmt w:val="bullet"/>
+      <w:lvlText w:val="o"/>
+      <w:lvlJc w:val="left"/>
+      <w:pPr>
+        <w:ind w:left="1440" w:hanging="360"/>
+      </w:pPr>
+      <w:rPr>
+        <w:rFonts w:ascii="Courier New" w:hAnsi="Courier New" w:cs="Courier New" w:hint="default"/>
+      </w:rPr>
+    </w:lvl>
+    <w:lvl w:ilvl="2" w:tplc="04100005" w:tentative="1">
+      <w:start w:val="1"/>
+      <w:numFmt w:val="bullet"/>
+      <w:lvlText w:val=""/>
+      <w:lvlJc w:val="left"/>
+      <w:pPr>
+        <w:ind w:left="2160" w:hanging="360"/>
+      </w:pPr>
+      <w:rPr>
+        <w:rFonts w:ascii="Wingdings" w:hAnsi="Wingdings" w:hint="default"/>
+      </w:rPr>
+    </w:lvl>
+    <w:lvl w:ilvl="3" w:tplc="04100001" w:tentative="1">
+      <w:start w:val="1"/>
+      <w:numFmt w:val="bullet"/>
+      <w:lvlText w:val=""/>
+      <w:lvlJc w:val="left"/>
+      <w:pPr>
+        <w:ind w:left="2880" w:hanging="360"/>
+      </w:pPr>
+      <w:rPr>
+        <w:rFonts w:ascii="Symbol" w:hAnsi="Symbol" w:hint="default"/>
+      </w:rPr>
+    </w:lvl>
+    <w:lvl w:ilvl="4" w:tplc="04100003" w:tentative="1">
+      <w:start w:val="1"/>
+      <w:numFmt w:val="bullet"/>
+      <w:lvlText w:val="o"/>
+      <w:lvlJc w:val="left"/>
+      <w:pPr>
+        <w:ind w:left="3600" w:hanging="360"/>
+      </w:pPr>
+      <w:rPr>
+        <w:rFonts w:ascii="Courier New" w:hAnsi="Courier New" w:cs="Courier New" w:hint="default"/>
+      </w:rPr>
+    </w:lvl>
+    <w:lvl w:ilvl="5" w:tplc="04100005" w:tentative="1">
+      <w:start w:val="1"/>
+      <w:numFmt w:val="bullet"/>
+      <w:lvlText w:val=""/>
+      <w:lvlJc w:val="left"/>
+      <w:pPr>
+        <w:ind w:left="4320" w:hanging="360"/>
+      </w:pPr>
+      <w:rPr>
+        <w:rFonts w:ascii="Wingdings" w:hAnsi="Wingdings" w:hint="default"/>
+      </w:rPr>
+    </w:lvl>
+    <w:lvl w:ilvl="6" w:tplc="04100001" w:tentative="1">
+      <w:start w:val="1"/>
+      <w:numFmt w:val="bullet"/>
+      <w:lvlText w:val=""/>
+      <w:lvlJc w:val="left"/>
+      <w:pPr>
+        <w:ind w:left="5040" w:hanging="360"/>
+      </w:pPr>
+      <w:rPr>
+        <w:rFonts w:ascii="Symbol" w:hAnsi="Symbol" w:hint="default"/>
+      </w:rPr>
+    </w:lvl>
+    <w:lvl w:ilvl="7" w:tplc="04100003" w:tentative="1">
+      <w:start w:val="1"/>
+      <w:numFmt w:val="bullet"/>
+      <w:lvlText w:val="o"/>
+      <w:lvlJc w:val="left"/>
+      <w:pPr>
+        <w:ind w:left="5760" w:hanging="360"/>
+      </w:pPr>
+      <w:rPr>
+        <w:rFonts w:ascii="Courier New" w:hAnsi="Courier New" w:cs="Courier New" w:hint="default"/>
+      </w:rPr>
+    </w:lvl>
+    <w:lvl w:ilvl="8" w:tplc="04100005" w:tentative="1">
+      <w:start w:val="1"/>
+      <w:numFmt w:val="bullet"/>
+      <w:lvlText w:val=""/>
+      <w:lvlJc w:val="left"/>
+      <w:pPr>
+        <w:ind w:left="6480" w:hanging="360"/>
+      </w:pPr>
+      <w:rPr>
+        <w:rFonts w:ascii="Wingdings" w:hAnsi="Wingdings" w:hint="default"/>
+      </w:rPr>
+    </w:lvl>
+  </w:abstractNum>
+  <w:num w:numId="1" w16cid:durableId="391320064">
+    <w:abstractNumId w:val="0"/>
+  </w:num>
+</w:numbering>
 </file>
 
 <file path=word/styles.xml><?xml version="1.0" encoding="utf-8"?>
@@ -961,6 +2395,50 @@
       <w:spacing w:val="5"/>
     </w:rPr>
   </w:style>
+  <w:style w:type="paragraph" w:styleId="Intestazione">
+    <w:name w:val="header"/>
+    <w:basedOn w:val="Normale"/>
+    <w:link w:val="IntestazioneCarattere"/>
+    <w:uiPriority w:val="99"/>
+    <w:unhideWhenUsed/>
+    <w:rsid w:val="0081064A"/>
+    <w:pPr>
+      <w:tabs>
+        <w:tab w:val="center" w:pos="4819"/>
+        <w:tab w:val="right" w:pos="9638"/>
+      </w:tabs>
+      <w:spacing w:after="0" w:line="240" w:lineRule="auto"/>
+    </w:pPr>
+  </w:style>
+  <w:style w:type="character" w:customStyle="1" w:styleId="IntestazioneCarattere">
+    <w:name w:val="Intestazione Carattere"/>
+    <w:basedOn w:val="Carpredefinitoparagrafo"/>
+    <w:link w:val="Intestazione"/>
+    <w:uiPriority w:val="99"/>
+    <w:rsid w:val="0081064A"/>
+  </w:style>
+  <w:style w:type="paragraph" w:styleId="Pidipagina">
+    <w:name w:val="footer"/>
+    <w:basedOn w:val="Normale"/>
+    <w:link w:val="PidipaginaCarattere"/>
+    <w:uiPriority w:val="99"/>
+    <w:unhideWhenUsed/>
+    <w:rsid w:val="0081064A"/>
+    <w:pPr>
+      <w:tabs>
+        <w:tab w:val="center" w:pos="4819"/>
+        <w:tab w:val="right" w:pos="9638"/>
+      </w:tabs>
+      <w:spacing w:after="0" w:line="240" w:lineRule="auto"/>
+    </w:pPr>
+  </w:style>
+  <w:style w:type="character" w:customStyle="1" w:styleId="PidipaginaCarattere">
+    <w:name w:val="Piè di pagina Carattere"/>
+    <w:basedOn w:val="Carpredefinitoparagrafo"/>
+    <w:link w:val="Pidipagina"/>
+    <w:uiPriority w:val="99"/>
+    <w:rsid w:val="0081064A"/>
+  </w:style>
 </w:styles>
 </file>
 

</xml_diff>

<commit_message>
Aggiunta di dati eclemma e branch coverage nel file testing
</commit_message>
<xml_diff>
--- a/documentazione/Testing.docx
+++ b/documentazione/Testing.docx
@@ -3,40 +3,16 @@
 <w:document xmlns:wpc="http://schemas.microsoft.com/office/word/2010/wordprocessingCanvas" xmlns:cx="http://schemas.microsoft.com/office/drawing/2014/chartex" xmlns:cx1="http://schemas.microsoft.com/office/drawing/2015/9/8/chartex" xmlns:cx2="http://schemas.microsoft.com/office/drawing/2015/10/21/chartex" xmlns:cx3="http://schemas.microsoft.com/office/drawing/2016/5/9/chartex" xmlns:cx4="http://schemas.microsoft.com/office/drawing/2016/5/10/chartex" xmlns:cx5="http://schemas.microsoft.com/office/drawing/2016/5/11/chartex" xmlns:cx6="http://schemas.microsoft.com/office/drawing/2016/5/12/chartex" xmlns:cx7="http://schemas.microsoft.com/office/drawing/2016/5/13/chartex" xmlns:cx8="http://schemas.microsoft.com/office/drawing/2016/5/14/chartex" xmlns:mc="http://schemas.openxmlformats.org/markup-compatibility/2006" xmlns:aink="http://schemas.microsoft.com/office/drawing/2016/ink" xmlns:am3d="http://schemas.microsoft.com/office/drawing/2017/model3d" xmlns:o="urn:schemas-microsoft-com:office:office" xmlns:oel="http://schemas.microsoft.com/office/2019/extlst" xmlns:r="http://schemas.openxmlformats.org/officeDocument/2006/relationships" xmlns:m="http://schemas.openxmlformats.org/officeDocument/2006/math" xmlns:v="urn:schemas-microsoft-com:vml" xmlns:wp14="http://schemas.microsoft.com/office/word/2010/wordprocessingDrawing" xmlns:wp="http://schemas.openxmlformats.org/drawingml/2006/wordprocessingDrawing" xmlns:w10="urn:schemas-microsoft-com:office:word" xmlns:w="http://schemas.openxmlformats.org/wordprocessingml/2006/main" xmlns:w14="http://schemas.microsoft.com/office/word/2010/wordml" xmlns:w15="http://schemas.microsoft.com/office/word/2012/wordml" xmlns:w16cex="http://schemas.microsoft.com/office/word/2018/wordml/cex" xmlns:w16cid="http://schemas.microsoft.com/office/word/2016/wordml/cid" xmlns:w16="http://schemas.microsoft.com/office/word/2018/wordml" xmlns:w16du="http://schemas.microsoft.com/office/word/2023/wordml/word16du" xmlns:w16sdtdh="http://schemas.microsoft.com/office/word/2020/wordml/sdtdatahash" xmlns:w16sdtfl="http://schemas.microsoft.com/office/word/2024/wordml/sdtformatlock" xmlns:w16se="http://schemas.microsoft.com/office/word/2015/wordml/symex" xmlns:wpg="http://schemas.microsoft.com/office/word/2010/wordprocessingGroup" xmlns:wpi="http://schemas.microsoft.com/office/word/2010/wordprocessingInk" xmlns:wne="http://schemas.microsoft.com/office/word/2006/wordml" xmlns:wps="http://schemas.microsoft.com/office/word/2010/wordprocessingShape" mc:Ignorable="w14 w15 w16se w16cid w16 w16cex w16sdtdh w16sdtfl w16du wp14">
   <w:body>
     <w:p>
+      <w:pPr>
+        <w:jc w:val="both"/>
+      </w:pPr>
       <w:r>
         <w:t>TESTING</w:t>
       </w:r>
     </w:p>
-    <w:p/>
     <w:p>
       <w:pPr>
-        <w:rPr>
-          <w:b/>
-          <w:bCs/>
-        </w:rPr>
-      </w:pPr>
-      <w:r>
-        <w:rPr>
-          <w:b/>
-          <w:bCs/>
-        </w:rPr>
-        <w:t>Software Testing</w:t>
-      </w:r>
-    </w:p>
-    <w:p>
-      <w:r>
-        <w:t xml:space="preserve">PUO’ avere un documento di plan per l’attività di test </w:t>
-      </w:r>
-      <w:r>
-        <w:t>D</w:t>
-      </w:r>
-      <w:r>
-        <w:t>EVE contenere dei casi di test di unità implementati con la loro descrizione nel documento DOVREBBE avere qualche misura di copertura per i casi di test Documentazione: Documentare i test in un documento.</w:t>
-      </w:r>
-    </w:p>
-    <w:p/>
-    <w:p>
-      <w:pPr>
+        <w:jc w:val="both"/>
         <w:rPr>
           <w:i/>
           <w:iCs/>
@@ -53,11 +29,23 @@
       </w:r>
     </w:p>
     <w:p>
+      <w:pPr>
+        <w:jc w:val="both"/>
+      </w:pPr>
       <w:r>
-        <w:t>Il team ha attutato una strategia di test White Box per verificare le funzionalità implementate e il codice interno.</w:t>
+        <w:t>Il team ha attu</w:t>
+      </w:r>
+      <w:r>
+        <w:t>at</w:t>
+      </w:r>
+      <w:r>
+        <w:t>o una strategia di test White Box per verificare le funzionalità implementate e il codice interno.</w:t>
       </w:r>
     </w:p>
     <w:p>
+      <w:pPr>
+        <w:jc w:val="both"/>
+      </w:pPr>
       <w:r>
         <w:t>L’attività di testing è stata suddivisa in:</w:t>
       </w:r>
@@ -69,9 +57,13 @@
           <w:ilvl w:val="0"/>
           <w:numId w:val="1"/>
         </w:numPr>
+        <w:jc w:val="both"/>
       </w:pPr>
       <w:r>
         <w:t>Unit Testing: utilizzo di JUnit5 per testare logica di business e validazione dei dati</w:t>
+      </w:r>
+      <w:r>
+        <w:t>, sviluppo di test automatizzati per componenti.</w:t>
       </w:r>
     </w:p>
     <w:p>
@@ -81,13 +73,18 @@
           <w:ilvl w:val="0"/>
           <w:numId w:val="1"/>
         </w:numPr>
+        <w:jc w:val="both"/>
       </w:pPr>
       <w:r>
         <w:t>Manual Testing: test manuale in seguito ad ogni modifica effettuata e prima di ogni commit</w:t>
       </w:r>
+      <w:r>
+        <w:t>. Test effettuati tramite interfaccia Vaadin navigando tra le viste.</w:t>
+      </w:r>
     </w:p>
     <w:p>
       <w:pPr>
+        <w:jc w:val="both"/>
         <w:rPr>
           <w:i/>
           <w:iCs/>
@@ -97,6 +94,7 @@
     </w:p>
     <w:p>
       <w:pPr>
+        <w:jc w:val="both"/>
         <w:rPr>
           <w:i/>
           <w:iCs/>
@@ -109,7 +107,15 @@
           <w:iCs/>
           <w:u w:val="single"/>
         </w:rPr>
-        <w:t>Test Implementati</w:t>
+        <w:t>Dettaglio dei T</w:t>
+      </w:r>
+      <w:r>
+        <w:rPr>
+          <w:i/>
+          <w:iCs/>
+          <w:u w:val="single"/>
+        </w:rPr>
+        <w:t>est Implementati</w:t>
       </w:r>
     </w:p>
     <w:tbl>
@@ -152,7 +158,7 @@
           </w:tcPr>
           <w:p>
             <w:pPr>
-              <w:jc w:val="center"/>
+              <w:jc w:val="both"/>
             </w:pPr>
             <w:r>
               <w:rPr>
@@ -183,7 +189,7 @@
           </w:tcPr>
           <w:p>
             <w:pPr>
-              <w:jc w:val="center"/>
+              <w:jc w:val="both"/>
             </w:pPr>
             <w:r>
               <w:rPr>
@@ -214,7 +220,7 @@
           </w:tcPr>
           <w:p>
             <w:pPr>
-              <w:jc w:val="center"/>
+              <w:jc w:val="both"/>
               <w:rPr>
                 <w:b/>
                 <w:bCs/>
@@ -254,7 +260,7 @@
           </w:tcPr>
           <w:p>
             <w:pPr>
-              <w:jc w:val="center"/>
+              <w:jc w:val="both"/>
             </w:pPr>
             <w:r>
               <w:rPr>
@@ -285,7 +291,7 @@
           </w:tcPr>
           <w:p>
             <w:pPr>
-              <w:jc w:val="center"/>
+              <w:jc w:val="both"/>
             </w:pPr>
             <w:r>
               <w:t>DataValidator</w:t>
@@ -312,10 +318,49 @@
           </w:tcPr>
           <w:p>
             <w:pPr>
-              <w:jc w:val="center"/>
+              <w:jc w:val="both"/>
             </w:pPr>
             <w:r>
               <w:t>Validazione dati inseriti in input</w:t>
+            </w:r>
+          </w:p>
+          <w:p>
+            <w:pPr>
+              <w:pStyle w:val="Paragrafoelenco"/>
+              <w:numPr>
+                <w:ilvl w:val="0"/>
+                <w:numId w:val="2"/>
+              </w:numPr>
+              <w:jc w:val="both"/>
+            </w:pPr>
+            <w:r>
+              <w:t>Campi nulli o vuoti</w:t>
+            </w:r>
+          </w:p>
+          <w:p>
+            <w:pPr>
+              <w:pStyle w:val="Paragrafoelenco"/>
+              <w:numPr>
+                <w:ilvl w:val="0"/>
+                <w:numId w:val="2"/>
+              </w:numPr>
+              <w:jc w:val="both"/>
+            </w:pPr>
+            <w:r>
+              <w:t>Password non coincidenti</w:t>
+            </w:r>
+          </w:p>
+          <w:p>
+            <w:pPr>
+              <w:pStyle w:val="Paragrafoelenco"/>
+              <w:numPr>
+                <w:ilvl w:val="0"/>
+                <w:numId w:val="2"/>
+              </w:numPr>
+              <w:jc w:val="both"/>
+            </w:pPr>
+            <w:r>
+              <w:t>Regex username e e-mail</w:t>
             </w:r>
           </w:p>
         </w:tc>
@@ -344,7 +389,7 @@
           </w:tcPr>
           <w:p>
             <w:pPr>
-              <w:jc w:val="center"/>
+              <w:jc w:val="both"/>
             </w:pPr>
             <w:r>
               <w:rPr>
@@ -375,7 +420,7 @@
           </w:tcPr>
           <w:p>
             <w:pPr>
-              <w:jc w:val="center"/>
+              <w:jc w:val="both"/>
             </w:pPr>
             <w:r>
               <w:t>Auto</w:t>
@@ -402,10 +447,21 @@
           </w:tcPr>
           <w:p>
             <w:pPr>
-              <w:jc w:val="center"/>
+              <w:jc w:val="both"/>
             </w:pPr>
             <w:r>
               <w:t>Verifica inizializzazione stato auto e percentuale carica</w:t>
+            </w:r>
+            <w:r>
+              <w:t xml:space="preserve"> in base al tipo di automobile </w:t>
+            </w:r>
+          </w:p>
+          <w:p>
+            <w:pPr>
+              <w:jc w:val="both"/>
+            </w:pPr>
+            <w:r>
+              <w:t>Inizializzazione coerente dello stato della carica.</w:t>
             </w:r>
           </w:p>
         </w:tc>
@@ -434,7 +490,7 @@
           </w:tcPr>
           <w:p>
             <w:pPr>
-              <w:jc w:val="center"/>
+              <w:jc w:val="both"/>
             </w:pPr>
             <w:r>
               <w:rPr>
@@ -465,7 +521,7 @@
           </w:tcPr>
           <w:p>
             <w:pPr>
-              <w:jc w:val="center"/>
+              <w:jc w:val="both"/>
             </w:pPr>
             <w:r>
               <w:t>Prenotazione</w:t>
@@ -492,10 +548,19 @@
           </w:tcPr>
           <w:p>
             <w:pPr>
-              <w:jc w:val="center"/>
-            </w:pPr>
-            <w:r>
-              <w:t>Verifica corretta inziziallizazione dello stato della prenotazione</w:t>
+              <w:jc w:val="both"/>
+            </w:pPr>
+            <w:r>
+              <w:t xml:space="preserve">Verifica corretta </w:t>
+            </w:r>
+            <w:r>
+              <w:t>inizializzazione</w:t>
+            </w:r>
+            <w:r>
+              <w:t xml:space="preserve"> dello stato della prenotazione</w:t>
+            </w:r>
+            <w:r>
+              <w:t>.</w:t>
             </w:r>
           </w:p>
         </w:tc>
@@ -524,7 +589,7 @@
           </w:tcPr>
           <w:p>
             <w:pPr>
-              <w:jc w:val="center"/>
+              <w:jc w:val="both"/>
             </w:pPr>
             <w:r>
               <w:rPr>
@@ -555,7 +620,7 @@
           </w:tcPr>
           <w:p>
             <w:pPr>
-              <w:jc w:val="center"/>
+              <w:jc w:val="both"/>
             </w:pPr>
             <w:r>
               <w:t>TipoAuto (Enum)</w:t>
@@ -582,7 +647,7 @@
           </w:tcPr>
           <w:p>
             <w:pPr>
-              <w:jc w:val="center"/>
+              <w:jc w:val="both"/>
             </w:pPr>
             <w:r>
               <w:t>Verifica conversione Stringa-Enumerativo anche in caso di input minuscolo/maiuscolo</w:t>
@@ -614,7 +679,7 @@
           </w:tcPr>
           <w:p>
             <w:pPr>
-              <w:jc w:val="center"/>
+              <w:jc w:val="both"/>
             </w:pPr>
             <w:r>
               <w:rPr>
@@ -645,7 +710,7 @@
           </w:tcPr>
           <w:p>
             <w:pPr>
-              <w:jc w:val="center"/>
+              <w:jc w:val="both"/>
             </w:pPr>
             <w:r>
               <w:t>QRCode</w:t>
@@ -672,10 +737,13 @@
           </w:tcPr>
           <w:p>
             <w:pPr>
-              <w:jc w:val="center"/>
+              <w:jc w:val="both"/>
             </w:pPr>
             <w:r>
               <w:t>Verifica generazione QR code corretta senza eccezioni</w:t>
+            </w:r>
+            <w:r>
+              <w:t xml:space="preserve"> tramite il metodo generaQR</w:t>
             </w:r>
           </w:p>
         </w:tc>
@@ -683,41 +751,42 @@
     </w:tbl>
     <w:p>
       <w:pPr>
-        <w:jc w:val="center"/>
+        <w:jc w:val="both"/>
       </w:pPr>
     </w:p>
     <w:p>
       <w:pPr>
-        <w:jc w:val="center"/>
+        <w:jc w:val="both"/>
       </w:pPr>
     </w:p>
     <w:p>
       <w:pPr>
-        <w:jc w:val="center"/>
+        <w:jc w:val="both"/>
       </w:pPr>
     </w:p>
     <w:p>
       <w:pPr>
-        <w:jc w:val="center"/>
+        <w:jc w:val="both"/>
       </w:pPr>
     </w:p>
     <w:p>
       <w:pPr>
-        <w:jc w:val="center"/>
+        <w:jc w:val="both"/>
       </w:pPr>
     </w:p>
     <w:p>
       <w:pPr>
-        <w:jc w:val="center"/>
+        <w:jc w:val="both"/>
+        <w:rPr>
+          <w:i/>
+          <w:iCs/>
+          <w:u w:val="single"/>
+        </w:rPr>
       </w:pPr>
     </w:p>
     <w:p>
       <w:pPr>
-        <w:jc w:val="center"/>
-      </w:pPr>
-    </w:p>
-    <w:p>
-      <w:pPr>
+        <w:jc w:val="both"/>
         <w:rPr>
           <w:i/>
           <w:iCs/>
@@ -735,24 +804,832 @@
       </w:r>
     </w:p>
     <w:p>
+      <w:pPr>
+        <w:jc w:val="both"/>
+      </w:pPr>
       <w:r>
-        <w:t>È stata effettuata un’analisi della copertura utilizzando EclEmma.</w:t>
+        <w:t xml:space="preserve">È stata effettuata un’analisi della copertura utilizzando </w:t>
+      </w:r>
+      <w:r>
+        <w:t xml:space="preserve">il tool </w:t>
+      </w:r>
+      <w:r>
+        <w:t>EclEmma.</w:t>
+      </w:r>
+      <w:r>
+        <w:t xml:space="preserve"> La strategia di testing ha evitato le classi views e database, concentrandosi maggiormente su pacchetti utils, models e enums.</w:t>
       </w:r>
     </w:p>
     <w:p>
+      <w:pPr>
+        <w:jc w:val="both"/>
+      </w:pPr>
       <w:r>
         <w:t>Qui la percentuale di istruzioni verificata dai test per le classi analizzate.</w:t>
       </w:r>
     </w:p>
-    <w:p/>
     <w:p>
+      <w:pPr>
+        <w:jc w:val="both"/>
+      </w:pPr>
+    </w:p>
+    <w:tbl>
+      <w:tblPr>
+        <w:tblW w:w="0" w:type="auto"/>
+        <w:tblCellSpacing w:w="15" w:type="dxa"/>
+        <w:tblCellMar>
+          <w:left w:w="0" w:type="dxa"/>
+          <w:right w:w="0" w:type="dxa"/>
+        </w:tblCellMar>
+        <w:tblLook w:val="04A0" w:firstRow="1" w:lastRow="0" w:firstColumn="1" w:lastColumn="0" w:noHBand="0" w:noVBand="1"/>
+      </w:tblPr>
+      <w:tblGrid>
+        <w:gridCol w:w="1693"/>
+        <w:gridCol w:w="1769"/>
+        <w:gridCol w:w="6160"/>
+      </w:tblGrid>
+      <w:tr>
+        <w:trPr>
+          <w:tblHeader/>
+          <w:tblCellSpacing w:w="15" w:type="dxa"/>
+        </w:trPr>
+        <w:tc>
+          <w:tcPr>
+            <w:tcW w:w="0" w:type="auto"/>
+            <w:tcBorders>
+              <w:top w:val="single" w:sz="6" w:space="0" w:color="auto"/>
+              <w:left w:val="single" w:sz="6" w:space="0" w:color="auto"/>
+              <w:bottom w:val="single" w:sz="6" w:space="0" w:color="auto"/>
+              <w:right w:val="single" w:sz="6" w:space="0" w:color="auto"/>
+            </w:tcBorders>
+            <w:tcMar>
+              <w:top w:w="120" w:type="dxa"/>
+              <w:left w:w="180" w:type="dxa"/>
+              <w:bottom w:w="120" w:type="dxa"/>
+              <w:right w:w="180" w:type="dxa"/>
+            </w:tcMar>
+            <w:vAlign w:val="center"/>
+            <w:hideMark/>
+          </w:tcPr>
+          <w:p>
+            <w:pPr>
+              <w:jc w:val="both"/>
+            </w:pPr>
+            <w:r>
+              <w:rPr>
+                <w:b/>
+                <w:bCs/>
+              </w:rPr>
+              <w:t>Classe Critica</w:t>
+            </w:r>
+          </w:p>
+        </w:tc>
+        <w:tc>
+          <w:tcPr>
+            <w:tcW w:w="1770" w:type="dxa"/>
+            <w:tcBorders>
+              <w:top w:val="single" w:sz="6" w:space="0" w:color="auto"/>
+              <w:left w:val="single" w:sz="6" w:space="0" w:color="auto"/>
+              <w:bottom w:val="single" w:sz="6" w:space="0" w:color="auto"/>
+              <w:right w:val="single" w:sz="6" w:space="0" w:color="auto"/>
+            </w:tcBorders>
+            <w:tcMar>
+              <w:top w:w="120" w:type="dxa"/>
+              <w:left w:w="180" w:type="dxa"/>
+              <w:bottom w:w="120" w:type="dxa"/>
+              <w:right w:w="180" w:type="dxa"/>
+            </w:tcMar>
+            <w:vAlign w:val="center"/>
+            <w:hideMark/>
+          </w:tcPr>
+          <w:p>
+            <w:pPr>
+              <w:jc w:val="both"/>
+            </w:pPr>
+            <w:r>
+              <w:rPr>
+                <w:b/>
+                <w:bCs/>
+              </w:rPr>
+              <w:t>Copertu</w:t>
+            </w:r>
+            <w:r>
+              <w:rPr>
+                <w:b/>
+                <w:bCs/>
+              </w:rPr>
+              <w:t>ra</w:t>
+            </w:r>
+          </w:p>
+        </w:tc>
+        <w:tc>
+          <w:tcPr>
+            <w:tcW w:w="6183" w:type="dxa"/>
+            <w:tcBorders>
+              <w:top w:val="single" w:sz="6" w:space="0" w:color="auto"/>
+              <w:left w:val="single" w:sz="6" w:space="0" w:color="auto"/>
+              <w:bottom w:val="single" w:sz="6" w:space="0" w:color="auto"/>
+              <w:right w:val="single" w:sz="6" w:space="0" w:color="auto"/>
+            </w:tcBorders>
+            <w:tcMar>
+              <w:top w:w="120" w:type="dxa"/>
+              <w:left w:w="180" w:type="dxa"/>
+              <w:bottom w:w="120" w:type="dxa"/>
+              <w:right w:w="180" w:type="dxa"/>
+            </w:tcMar>
+            <w:vAlign w:val="center"/>
+            <w:hideMark/>
+          </w:tcPr>
+          <w:p>
+            <w:pPr>
+              <w:jc w:val="both"/>
+              <w:rPr>
+                <w:b/>
+                <w:bCs/>
+              </w:rPr>
+            </w:pPr>
+            <w:r>
+              <w:rPr>
+                <w:b/>
+                <w:bCs/>
+              </w:rPr>
+              <w:t>Percentuale Eclemma</w:t>
+            </w:r>
+          </w:p>
+        </w:tc>
+      </w:tr>
+      <w:tr>
+        <w:trPr>
+          <w:tblCellSpacing w:w="15" w:type="dxa"/>
+        </w:trPr>
+        <w:tc>
+          <w:tcPr>
+            <w:tcW w:w="0" w:type="auto"/>
+            <w:tcBorders>
+              <w:top w:val="single" w:sz="6" w:space="0" w:color="auto"/>
+              <w:left w:val="single" w:sz="6" w:space="0" w:color="auto"/>
+              <w:bottom w:val="single" w:sz="6" w:space="0" w:color="auto"/>
+              <w:right w:val="single" w:sz="6" w:space="0" w:color="auto"/>
+            </w:tcBorders>
+            <w:tcMar>
+              <w:top w:w="120" w:type="dxa"/>
+              <w:left w:w="180" w:type="dxa"/>
+              <w:bottom w:w="120" w:type="dxa"/>
+              <w:right w:w="180" w:type="dxa"/>
+            </w:tcMar>
+            <w:vAlign w:val="center"/>
+            <w:hideMark/>
+          </w:tcPr>
+          <w:p>
+            <w:pPr>
+              <w:jc w:val="both"/>
+            </w:pPr>
+            <w:r>
+              <w:rPr>
+                <w:b/>
+                <w:bCs/>
+              </w:rPr>
+              <w:t>DataValidator</w:t>
+            </w:r>
+          </w:p>
+        </w:tc>
+        <w:tc>
+          <w:tcPr>
+            <w:tcW w:w="1770" w:type="dxa"/>
+            <w:tcBorders>
+              <w:top w:val="single" w:sz="6" w:space="0" w:color="auto"/>
+              <w:left w:val="single" w:sz="6" w:space="0" w:color="auto"/>
+              <w:bottom w:val="single" w:sz="6" w:space="0" w:color="auto"/>
+              <w:right w:val="single" w:sz="6" w:space="0" w:color="auto"/>
+            </w:tcBorders>
+            <w:tcMar>
+              <w:top w:w="120" w:type="dxa"/>
+              <w:left w:w="180" w:type="dxa"/>
+              <w:bottom w:w="120" w:type="dxa"/>
+              <w:right w:w="180" w:type="dxa"/>
+            </w:tcMar>
+            <w:vAlign w:val="center"/>
+            <w:hideMark/>
+          </w:tcPr>
+          <w:p>
+            <w:pPr>
+              <w:jc w:val="both"/>
+            </w:pPr>
+            <w:r>
+              <w:t>58,9%</w:t>
+            </w:r>
+          </w:p>
+        </w:tc>
+        <w:tc>
+          <w:tcPr>
+            <w:tcW w:w="6183" w:type="dxa"/>
+            <w:tcBorders>
+              <w:top w:val="single" w:sz="6" w:space="0" w:color="auto"/>
+              <w:left w:val="single" w:sz="6" w:space="0" w:color="auto"/>
+              <w:bottom w:val="single" w:sz="6" w:space="0" w:color="auto"/>
+              <w:right w:val="single" w:sz="6" w:space="0" w:color="auto"/>
+            </w:tcBorders>
+            <w:tcMar>
+              <w:top w:w="120" w:type="dxa"/>
+              <w:left w:w="180" w:type="dxa"/>
+              <w:bottom w:w="120" w:type="dxa"/>
+              <w:right w:w="180" w:type="dxa"/>
+            </w:tcMar>
+            <w:vAlign w:val="center"/>
+            <w:hideMark/>
+          </w:tcPr>
+          <w:p>
+            <w:pPr>
+              <w:jc w:val="both"/>
+            </w:pPr>
+            <w:r>
+              <w:drawing>
+                <wp:inline distT="0" distB="0" distL="0" distR="0" wp14:anchorId="6DEAA3AE" wp14:editId="68B4A1A2">
+                  <wp:extent cx="2934128" cy="170180"/>
+                  <wp:effectExtent l="0" t="0" r="0" b="1270"/>
+                  <wp:docPr id="1832088763" name="Immagine 1"/>
+                  <wp:cNvGraphicFramePr>
+                    <a:graphicFrameLocks xmlns:a="http://schemas.openxmlformats.org/drawingml/2006/main" noChangeAspect="1"/>
+                  </wp:cNvGraphicFramePr>
+                  <a:graphic xmlns:a="http://schemas.openxmlformats.org/drawingml/2006/main">
+                    <a:graphicData uri="http://schemas.openxmlformats.org/drawingml/2006/picture">
+                      <pic:pic xmlns:pic="http://schemas.openxmlformats.org/drawingml/2006/picture">
+                        <pic:nvPicPr>
+                          <pic:cNvPr id="1832088763" name=""/>
+                          <pic:cNvPicPr/>
+                        </pic:nvPicPr>
+                        <pic:blipFill rotWithShape="1">
+                          <a:blip r:embed="rId7"/>
+                          <a:srcRect l="2714"/>
+                          <a:stretch>
+                            <a:fillRect/>
+                          </a:stretch>
+                        </pic:blipFill>
+                        <pic:spPr bwMode="auto">
+                          <a:xfrm>
+                            <a:off x="0" y="0"/>
+                            <a:ext cx="2941938" cy="170633"/>
+                          </a:xfrm>
+                          <a:prstGeom prst="rect">
+                            <a:avLst/>
+                          </a:prstGeom>
+                          <a:ln>
+                            <a:noFill/>
+                          </a:ln>
+                          <a:extLst>
+                            <a:ext uri="{53640926-AAD7-44D8-BBD7-CCE9431645EC}">
+                              <a14:shadowObscured xmlns:a14="http://schemas.microsoft.com/office/drawing/2010/main"/>
+                            </a:ext>
+                          </a:extLst>
+                        </pic:spPr>
+                      </pic:pic>
+                    </a:graphicData>
+                  </a:graphic>
+                </wp:inline>
+              </w:drawing>
+            </w:r>
+          </w:p>
+        </w:tc>
+      </w:tr>
+      <w:tr>
+        <w:trPr>
+          <w:tblCellSpacing w:w="15" w:type="dxa"/>
+        </w:trPr>
+        <w:tc>
+          <w:tcPr>
+            <w:tcW w:w="0" w:type="auto"/>
+            <w:tcBorders>
+              <w:top w:val="single" w:sz="6" w:space="0" w:color="auto"/>
+              <w:left w:val="single" w:sz="6" w:space="0" w:color="auto"/>
+              <w:bottom w:val="single" w:sz="6" w:space="0" w:color="auto"/>
+              <w:right w:val="single" w:sz="6" w:space="0" w:color="auto"/>
+            </w:tcBorders>
+            <w:tcMar>
+              <w:top w:w="120" w:type="dxa"/>
+              <w:left w:w="180" w:type="dxa"/>
+              <w:bottom w:w="120" w:type="dxa"/>
+              <w:right w:w="180" w:type="dxa"/>
+            </w:tcMar>
+            <w:vAlign w:val="center"/>
+            <w:hideMark/>
+          </w:tcPr>
+          <w:p>
+            <w:pPr>
+              <w:jc w:val="both"/>
+            </w:pPr>
+            <w:r>
+              <w:rPr>
+                <w:b/>
+                <w:bCs/>
+              </w:rPr>
+              <w:t>Auto</w:t>
+            </w:r>
+          </w:p>
+        </w:tc>
+        <w:tc>
+          <w:tcPr>
+            <w:tcW w:w="1770" w:type="dxa"/>
+            <w:tcBorders>
+              <w:top w:val="single" w:sz="6" w:space="0" w:color="auto"/>
+              <w:left w:val="single" w:sz="6" w:space="0" w:color="auto"/>
+              <w:bottom w:val="single" w:sz="6" w:space="0" w:color="auto"/>
+              <w:right w:val="single" w:sz="6" w:space="0" w:color="auto"/>
+            </w:tcBorders>
+            <w:tcMar>
+              <w:top w:w="120" w:type="dxa"/>
+              <w:left w:w="180" w:type="dxa"/>
+              <w:bottom w:w="120" w:type="dxa"/>
+              <w:right w:w="180" w:type="dxa"/>
+            </w:tcMar>
+            <w:vAlign w:val="center"/>
+            <w:hideMark/>
+          </w:tcPr>
+          <w:p>
+            <w:pPr>
+              <w:jc w:val="both"/>
+            </w:pPr>
+            <w:r>
+              <w:t>62,2%</w:t>
+            </w:r>
+          </w:p>
+        </w:tc>
+        <w:tc>
+          <w:tcPr>
+            <w:tcW w:w="6183" w:type="dxa"/>
+            <w:tcBorders>
+              <w:top w:val="single" w:sz="6" w:space="0" w:color="auto"/>
+              <w:left w:val="single" w:sz="6" w:space="0" w:color="auto"/>
+              <w:bottom w:val="single" w:sz="6" w:space="0" w:color="auto"/>
+              <w:right w:val="single" w:sz="6" w:space="0" w:color="auto"/>
+            </w:tcBorders>
+            <w:tcMar>
+              <w:top w:w="120" w:type="dxa"/>
+              <w:left w:w="180" w:type="dxa"/>
+              <w:bottom w:w="120" w:type="dxa"/>
+              <w:right w:w="180" w:type="dxa"/>
+            </w:tcMar>
+            <w:vAlign w:val="center"/>
+            <w:hideMark/>
+          </w:tcPr>
+          <w:p>
+            <w:pPr>
+              <w:jc w:val="both"/>
+            </w:pPr>
+            <w:r>
+              <w:drawing>
+                <wp:inline distT="0" distB="0" distL="0" distR="0" wp14:anchorId="456B48B7" wp14:editId="6336D24B">
+                  <wp:extent cx="2962688" cy="171474"/>
+                  <wp:effectExtent l="0" t="0" r="0" b="0"/>
+                  <wp:docPr id="1388598436" name="Immagine 1"/>
+                  <wp:cNvGraphicFramePr>
+                    <a:graphicFrameLocks xmlns:a="http://schemas.openxmlformats.org/drawingml/2006/main" noChangeAspect="1"/>
+                  </wp:cNvGraphicFramePr>
+                  <a:graphic xmlns:a="http://schemas.openxmlformats.org/drawingml/2006/main">
+                    <a:graphicData uri="http://schemas.openxmlformats.org/drawingml/2006/picture">
+                      <pic:pic xmlns:pic="http://schemas.openxmlformats.org/drawingml/2006/picture">
+                        <pic:nvPicPr>
+                          <pic:cNvPr id="1388598436" name=""/>
+                          <pic:cNvPicPr/>
+                        </pic:nvPicPr>
+                        <pic:blipFill>
+                          <a:blip r:embed="rId8"/>
+                          <a:stretch>
+                            <a:fillRect/>
+                          </a:stretch>
+                        </pic:blipFill>
+                        <pic:spPr>
+                          <a:xfrm>
+                            <a:off x="0" y="0"/>
+                            <a:ext cx="2962688" cy="171474"/>
+                          </a:xfrm>
+                          <a:prstGeom prst="rect">
+                            <a:avLst/>
+                          </a:prstGeom>
+                        </pic:spPr>
+                      </pic:pic>
+                    </a:graphicData>
+                  </a:graphic>
+                </wp:inline>
+              </w:drawing>
+            </w:r>
+          </w:p>
+        </w:tc>
+      </w:tr>
+      <w:tr>
+        <w:trPr>
+          <w:tblCellSpacing w:w="15" w:type="dxa"/>
+        </w:trPr>
+        <w:tc>
+          <w:tcPr>
+            <w:tcW w:w="0" w:type="auto"/>
+            <w:tcBorders>
+              <w:top w:val="single" w:sz="6" w:space="0" w:color="auto"/>
+              <w:left w:val="single" w:sz="6" w:space="0" w:color="auto"/>
+              <w:bottom w:val="single" w:sz="6" w:space="0" w:color="auto"/>
+              <w:right w:val="single" w:sz="6" w:space="0" w:color="auto"/>
+            </w:tcBorders>
+            <w:tcMar>
+              <w:top w:w="120" w:type="dxa"/>
+              <w:left w:w="180" w:type="dxa"/>
+              <w:bottom w:w="120" w:type="dxa"/>
+              <w:right w:w="180" w:type="dxa"/>
+            </w:tcMar>
+            <w:vAlign w:val="center"/>
+            <w:hideMark/>
+          </w:tcPr>
+          <w:p>
+            <w:pPr>
+              <w:jc w:val="both"/>
+            </w:pPr>
+            <w:r>
+              <w:rPr>
+                <w:b/>
+                <w:bCs/>
+              </w:rPr>
+              <w:t>Prenotazione</w:t>
+            </w:r>
+          </w:p>
+        </w:tc>
+        <w:tc>
+          <w:tcPr>
+            <w:tcW w:w="1770" w:type="dxa"/>
+            <w:tcBorders>
+              <w:top w:val="single" w:sz="6" w:space="0" w:color="auto"/>
+              <w:left w:val="single" w:sz="6" w:space="0" w:color="auto"/>
+              <w:bottom w:val="single" w:sz="6" w:space="0" w:color="auto"/>
+              <w:right w:val="single" w:sz="6" w:space="0" w:color="auto"/>
+            </w:tcBorders>
+            <w:tcMar>
+              <w:top w:w="120" w:type="dxa"/>
+              <w:left w:w="180" w:type="dxa"/>
+              <w:bottom w:w="120" w:type="dxa"/>
+              <w:right w:w="180" w:type="dxa"/>
+            </w:tcMar>
+            <w:vAlign w:val="center"/>
+            <w:hideMark/>
+          </w:tcPr>
+          <w:p>
+            <w:pPr>
+              <w:jc w:val="both"/>
+            </w:pPr>
+            <w:r>
+              <w:t>68,2%</w:t>
+            </w:r>
+          </w:p>
+        </w:tc>
+        <w:tc>
+          <w:tcPr>
+            <w:tcW w:w="6183" w:type="dxa"/>
+            <w:tcBorders>
+              <w:top w:val="single" w:sz="6" w:space="0" w:color="auto"/>
+              <w:left w:val="single" w:sz="6" w:space="0" w:color="auto"/>
+              <w:bottom w:val="single" w:sz="6" w:space="0" w:color="auto"/>
+              <w:right w:val="single" w:sz="6" w:space="0" w:color="auto"/>
+            </w:tcBorders>
+            <w:tcMar>
+              <w:top w:w="120" w:type="dxa"/>
+              <w:left w:w="180" w:type="dxa"/>
+              <w:bottom w:w="120" w:type="dxa"/>
+              <w:right w:w="180" w:type="dxa"/>
+            </w:tcMar>
+            <w:vAlign w:val="center"/>
+            <w:hideMark/>
+          </w:tcPr>
+          <w:p>
+            <w:pPr>
+              <w:jc w:val="both"/>
+            </w:pPr>
+            <w:r>
+              <w:drawing>
+                <wp:inline distT="0" distB="0" distL="0" distR="0" wp14:anchorId="7E617F0B" wp14:editId="1349109E">
+                  <wp:extent cx="3010320" cy="152421"/>
+                  <wp:effectExtent l="0" t="0" r="0" b="0"/>
+                  <wp:docPr id="262993503" name="Immagine 1"/>
+                  <wp:cNvGraphicFramePr>
+                    <a:graphicFrameLocks xmlns:a="http://schemas.openxmlformats.org/drawingml/2006/main" noChangeAspect="1"/>
+                  </wp:cNvGraphicFramePr>
+                  <a:graphic xmlns:a="http://schemas.openxmlformats.org/drawingml/2006/main">
+                    <a:graphicData uri="http://schemas.openxmlformats.org/drawingml/2006/picture">
+                      <pic:pic xmlns:pic="http://schemas.openxmlformats.org/drawingml/2006/picture">
+                        <pic:nvPicPr>
+                          <pic:cNvPr id="262993503" name=""/>
+                          <pic:cNvPicPr/>
+                        </pic:nvPicPr>
+                        <pic:blipFill>
+                          <a:blip r:embed="rId9"/>
+                          <a:stretch>
+                            <a:fillRect/>
+                          </a:stretch>
+                        </pic:blipFill>
+                        <pic:spPr>
+                          <a:xfrm>
+                            <a:off x="0" y="0"/>
+                            <a:ext cx="3010320" cy="152421"/>
+                          </a:xfrm>
+                          <a:prstGeom prst="rect">
+                            <a:avLst/>
+                          </a:prstGeom>
+                        </pic:spPr>
+                      </pic:pic>
+                    </a:graphicData>
+                  </a:graphic>
+                </wp:inline>
+              </w:drawing>
+            </w:r>
+          </w:p>
+        </w:tc>
+      </w:tr>
+      <w:tr>
+        <w:trPr>
+          <w:tblCellSpacing w:w="15" w:type="dxa"/>
+        </w:trPr>
+        <w:tc>
+          <w:tcPr>
+            <w:tcW w:w="0" w:type="auto"/>
+            <w:tcBorders>
+              <w:top w:val="single" w:sz="6" w:space="0" w:color="auto"/>
+              <w:left w:val="single" w:sz="6" w:space="0" w:color="auto"/>
+              <w:bottom w:val="single" w:sz="6" w:space="0" w:color="auto"/>
+              <w:right w:val="single" w:sz="6" w:space="0" w:color="auto"/>
+            </w:tcBorders>
+            <w:tcMar>
+              <w:top w:w="120" w:type="dxa"/>
+              <w:left w:w="180" w:type="dxa"/>
+              <w:bottom w:w="120" w:type="dxa"/>
+              <w:right w:w="180" w:type="dxa"/>
+            </w:tcMar>
+            <w:vAlign w:val="center"/>
+            <w:hideMark/>
+          </w:tcPr>
+          <w:p>
+            <w:pPr>
+              <w:jc w:val="both"/>
+            </w:pPr>
+            <w:r>
+              <w:rPr>
+                <w:b/>
+                <w:bCs/>
+              </w:rPr>
+              <w:t>TipoAuto</w:t>
+            </w:r>
+          </w:p>
+        </w:tc>
+        <w:tc>
+          <w:tcPr>
+            <w:tcW w:w="1770" w:type="dxa"/>
+            <w:tcBorders>
+              <w:top w:val="single" w:sz="6" w:space="0" w:color="auto"/>
+              <w:left w:val="single" w:sz="6" w:space="0" w:color="auto"/>
+              <w:bottom w:val="single" w:sz="6" w:space="0" w:color="auto"/>
+              <w:right w:val="single" w:sz="6" w:space="0" w:color="auto"/>
+            </w:tcBorders>
+            <w:tcMar>
+              <w:top w:w="120" w:type="dxa"/>
+              <w:left w:w="180" w:type="dxa"/>
+              <w:bottom w:w="120" w:type="dxa"/>
+              <w:right w:w="180" w:type="dxa"/>
+            </w:tcMar>
+            <w:vAlign w:val="center"/>
+            <w:hideMark/>
+          </w:tcPr>
+          <w:p>
+            <w:pPr>
+              <w:jc w:val="both"/>
+            </w:pPr>
+            <w:r>
+              <w:t>96,4%</w:t>
+            </w:r>
+          </w:p>
+        </w:tc>
+        <w:tc>
+          <w:tcPr>
+            <w:tcW w:w="6183" w:type="dxa"/>
+            <w:tcBorders>
+              <w:top w:val="single" w:sz="6" w:space="0" w:color="auto"/>
+              <w:left w:val="single" w:sz="6" w:space="0" w:color="auto"/>
+              <w:bottom w:val="single" w:sz="6" w:space="0" w:color="auto"/>
+              <w:right w:val="single" w:sz="6" w:space="0" w:color="auto"/>
+            </w:tcBorders>
+            <w:tcMar>
+              <w:top w:w="120" w:type="dxa"/>
+              <w:left w:w="180" w:type="dxa"/>
+              <w:bottom w:w="120" w:type="dxa"/>
+              <w:right w:w="180" w:type="dxa"/>
+            </w:tcMar>
+            <w:vAlign w:val="center"/>
+            <w:hideMark/>
+          </w:tcPr>
+          <w:p>
+            <w:pPr>
+              <w:jc w:val="both"/>
+            </w:pPr>
+            <w:r>
+              <w:drawing>
+                <wp:inline distT="0" distB="0" distL="0" distR="0" wp14:anchorId="29141D23" wp14:editId="15CE9F76">
+                  <wp:extent cx="3038899" cy="181000"/>
+                  <wp:effectExtent l="0" t="0" r="9525" b="9525"/>
+                  <wp:docPr id="501036281" name="Immagine 1"/>
+                  <wp:cNvGraphicFramePr>
+                    <a:graphicFrameLocks xmlns:a="http://schemas.openxmlformats.org/drawingml/2006/main" noChangeAspect="1"/>
+                  </wp:cNvGraphicFramePr>
+                  <a:graphic xmlns:a="http://schemas.openxmlformats.org/drawingml/2006/main">
+                    <a:graphicData uri="http://schemas.openxmlformats.org/drawingml/2006/picture">
+                      <pic:pic xmlns:pic="http://schemas.openxmlformats.org/drawingml/2006/picture">
+                        <pic:nvPicPr>
+                          <pic:cNvPr id="501036281" name=""/>
+                          <pic:cNvPicPr/>
+                        </pic:nvPicPr>
+                        <pic:blipFill>
+                          <a:blip r:embed="rId10"/>
+                          <a:stretch>
+                            <a:fillRect/>
+                          </a:stretch>
+                        </pic:blipFill>
+                        <pic:spPr>
+                          <a:xfrm>
+                            <a:off x="0" y="0"/>
+                            <a:ext cx="3038899" cy="181000"/>
+                          </a:xfrm>
+                          <a:prstGeom prst="rect">
+                            <a:avLst/>
+                          </a:prstGeom>
+                        </pic:spPr>
+                      </pic:pic>
+                    </a:graphicData>
+                  </a:graphic>
+                </wp:inline>
+              </w:drawing>
+            </w:r>
+          </w:p>
+        </w:tc>
+      </w:tr>
+      <w:tr>
+        <w:trPr>
+          <w:tblCellSpacing w:w="15" w:type="dxa"/>
+        </w:trPr>
+        <w:tc>
+          <w:tcPr>
+            <w:tcW w:w="0" w:type="auto"/>
+            <w:tcBorders>
+              <w:top w:val="single" w:sz="6" w:space="0" w:color="auto"/>
+              <w:left w:val="single" w:sz="6" w:space="0" w:color="auto"/>
+              <w:bottom w:val="single" w:sz="6" w:space="0" w:color="auto"/>
+              <w:right w:val="single" w:sz="6" w:space="0" w:color="auto"/>
+            </w:tcBorders>
+            <w:tcMar>
+              <w:top w:w="120" w:type="dxa"/>
+              <w:left w:w="180" w:type="dxa"/>
+              <w:bottom w:w="120" w:type="dxa"/>
+              <w:right w:w="180" w:type="dxa"/>
+            </w:tcMar>
+            <w:vAlign w:val="center"/>
+            <w:hideMark/>
+          </w:tcPr>
+          <w:p>
+            <w:pPr>
+              <w:jc w:val="both"/>
+            </w:pPr>
+            <w:r>
+              <w:rPr>
+                <w:b/>
+                <w:bCs/>
+              </w:rPr>
+              <w:t>QRCode</w:t>
+            </w:r>
+          </w:p>
+        </w:tc>
+        <w:tc>
+          <w:tcPr>
+            <w:tcW w:w="1770" w:type="dxa"/>
+            <w:tcBorders>
+              <w:top w:val="single" w:sz="6" w:space="0" w:color="auto"/>
+              <w:left w:val="single" w:sz="6" w:space="0" w:color="auto"/>
+              <w:bottom w:val="single" w:sz="6" w:space="0" w:color="auto"/>
+              <w:right w:val="single" w:sz="6" w:space="0" w:color="auto"/>
+            </w:tcBorders>
+            <w:tcMar>
+              <w:top w:w="120" w:type="dxa"/>
+              <w:left w:w="180" w:type="dxa"/>
+              <w:bottom w:w="120" w:type="dxa"/>
+              <w:right w:w="180" w:type="dxa"/>
+            </w:tcMar>
+            <w:vAlign w:val="center"/>
+            <w:hideMark/>
+          </w:tcPr>
+          <w:p>
+            <w:pPr>
+              <w:jc w:val="both"/>
+            </w:pPr>
+            <w:r>
+              <w:t>85,7%</w:t>
+            </w:r>
+          </w:p>
+        </w:tc>
+        <w:tc>
+          <w:tcPr>
+            <w:tcW w:w="6183" w:type="dxa"/>
+            <w:tcBorders>
+              <w:top w:val="single" w:sz="6" w:space="0" w:color="auto"/>
+              <w:left w:val="single" w:sz="6" w:space="0" w:color="auto"/>
+              <w:bottom w:val="single" w:sz="6" w:space="0" w:color="auto"/>
+              <w:right w:val="single" w:sz="6" w:space="0" w:color="auto"/>
+            </w:tcBorders>
+            <w:tcMar>
+              <w:top w:w="120" w:type="dxa"/>
+              <w:left w:w="180" w:type="dxa"/>
+              <w:bottom w:w="120" w:type="dxa"/>
+              <w:right w:w="180" w:type="dxa"/>
+            </w:tcMar>
+            <w:vAlign w:val="center"/>
+            <w:hideMark/>
+          </w:tcPr>
+          <w:p>
+            <w:pPr>
+              <w:jc w:val="both"/>
+            </w:pPr>
+            <w:r>
+              <w:drawing>
+                <wp:inline distT="0" distB="0" distL="0" distR="0" wp14:anchorId="03622411" wp14:editId="2D652689">
+                  <wp:extent cx="2981741" cy="152421"/>
+                  <wp:effectExtent l="0" t="0" r="9525" b="0"/>
+                  <wp:docPr id="320309135" name="Immagine 1"/>
+                  <wp:cNvGraphicFramePr>
+                    <a:graphicFrameLocks xmlns:a="http://schemas.openxmlformats.org/drawingml/2006/main" noChangeAspect="1"/>
+                  </wp:cNvGraphicFramePr>
+                  <a:graphic xmlns:a="http://schemas.openxmlformats.org/drawingml/2006/main">
+                    <a:graphicData uri="http://schemas.openxmlformats.org/drawingml/2006/picture">
+                      <pic:pic xmlns:pic="http://schemas.openxmlformats.org/drawingml/2006/picture">
+                        <pic:nvPicPr>
+                          <pic:cNvPr id="320309135" name=""/>
+                          <pic:cNvPicPr/>
+                        </pic:nvPicPr>
+                        <pic:blipFill>
+                          <a:blip r:embed="rId11"/>
+                          <a:stretch>
+                            <a:fillRect/>
+                          </a:stretch>
+                        </pic:blipFill>
+                        <pic:spPr>
+                          <a:xfrm>
+                            <a:off x="0" y="0"/>
+                            <a:ext cx="2981741" cy="152421"/>
+                          </a:xfrm>
+                          <a:prstGeom prst="rect">
+                            <a:avLst/>
+                          </a:prstGeom>
+                        </pic:spPr>
+                      </pic:pic>
+                    </a:graphicData>
+                  </a:graphic>
+                </wp:inline>
+              </w:drawing>
+            </w:r>
+          </w:p>
+        </w:tc>
+      </w:tr>
+    </w:tbl>
+    <w:p>
+      <w:pPr>
+        <w:jc w:val="both"/>
+      </w:pPr>
+    </w:p>
+    <w:p>
+      <w:pPr>
+        <w:spacing w:after="0"/>
+        <w:jc w:val="both"/>
+      </w:pPr>
       <w:r>
-        <w:t>AGGIUNGERE PERCENTUALI CON ECLEMMA!!!</w:t>
+        <w:t>Le percentuali riflettono una strategia di testing focalizzata su metodi con maggior rischio di errore, evitando test su metodi secondari, getter e setter.</w:t>
       </w:r>
     </w:p>
     <w:p>
       <w:pPr>
-        <w:jc w:val="center"/>
+        <w:spacing w:after="0"/>
+        <w:jc w:val="both"/>
+      </w:pPr>
+      <w:r>
+        <w:t>Questo riduce la percentuale di copertura di alcune classi, ma mantenendo la copertura delle regole e delle parti critiche del codice.</w:t>
+      </w:r>
+    </w:p>
+    <w:p>
+      <w:pPr>
+        <w:spacing w:after="0"/>
+        <w:jc w:val="both"/>
+      </w:pPr>
+    </w:p>
+    <w:p>
+      <w:pPr>
+        <w:spacing w:after="0"/>
+        <w:jc w:val="both"/>
+      </w:pPr>
+      <w:r>
+        <w:t>Analizzando la branch-coverage otteniamo:</w:t>
+      </w:r>
+    </w:p>
+    <w:p>
+      <w:pPr>
+        <w:spacing w:after="0"/>
+        <w:jc w:val="both"/>
       </w:pPr>
     </w:p>
     <w:tbl>
@@ -795,7 +1672,7 @@
           </w:tcPr>
           <w:p>
             <w:pPr>
-              <w:jc w:val="center"/>
+              <w:jc w:val="both"/>
             </w:pPr>
             <w:r>
               <w:rPr>
@@ -826,7 +1703,7 @@
           </w:tcPr>
           <w:p>
             <w:pPr>
-              <w:jc w:val="center"/>
+              <w:jc w:val="both"/>
             </w:pPr>
             <w:r>
               <w:rPr>
@@ -864,10 +1741,18 @@
           </w:tcPr>
           <w:p>
             <w:pPr>
-              <w:jc w:val="center"/>
-            </w:pPr>
-            <w:r>
-              <w:t>Percentuale Eclemma</w:t>
+              <w:jc w:val="both"/>
+              <w:rPr>
+                <w:b/>
+                <w:bCs/>
+              </w:rPr>
+            </w:pPr>
+            <w:r>
+              <w:rPr>
+                <w:b/>
+                <w:bCs/>
+              </w:rPr>
+              <w:t>Descrizione</w:t>
             </w:r>
           </w:p>
         </w:tc>
@@ -896,7 +1781,7 @@
           </w:tcPr>
           <w:p>
             <w:pPr>
-              <w:jc w:val="center"/>
+              <w:jc w:val="both"/>
             </w:pPr>
             <w:r>
               <w:rPr>
@@ -927,10 +1812,10 @@
           </w:tcPr>
           <w:p>
             <w:pPr>
-              <w:jc w:val="center"/>
-            </w:pPr>
-            <w:r>
-              <w:t>%</w:t>
+              <w:jc w:val="both"/>
+            </w:pPr>
+            <w:r>
+              <w:t>75 %</w:t>
             </w:r>
           </w:p>
         </w:tc>
@@ -954,10 +1839,10 @@
           </w:tcPr>
           <w:p>
             <w:pPr>
-              <w:jc w:val="center"/>
-            </w:pPr>
-            <w:r>
-              <w:t>Screen Eclemma</w:t>
+              <w:jc w:val="both"/>
+            </w:pPr>
+            <w:r>
+              <w:t>Coperti rami decisionali</w:t>
             </w:r>
           </w:p>
         </w:tc>
@@ -986,7 +1871,7 @@
           </w:tcPr>
           <w:p>
             <w:pPr>
-              <w:jc w:val="center"/>
+              <w:jc w:val="both"/>
             </w:pPr>
             <w:r>
               <w:rPr>
@@ -1017,8 +1902,11 @@
           </w:tcPr>
           <w:p>
             <w:pPr>
-              <w:jc w:val="center"/>
-            </w:pPr>
+              <w:jc w:val="both"/>
+            </w:pPr>
+            <w:r>
+              <w:t>100%</w:t>
+            </w:r>
           </w:p>
         </w:tc>
         <w:tc>
@@ -1041,8 +1929,11 @@
           </w:tcPr>
           <w:p>
             <w:pPr>
-              <w:jc w:val="center"/>
-            </w:pPr>
+              <w:jc w:val="both"/>
+            </w:pPr>
+            <w:r>
+              <w:t>Copertura totale</w:t>
+            </w:r>
           </w:p>
         </w:tc>
       </w:tr>
@@ -1070,7 +1961,7 @@
           </w:tcPr>
           <w:p>
             <w:pPr>
-              <w:jc w:val="center"/>
+              <w:jc w:val="both"/>
             </w:pPr>
             <w:r>
               <w:rPr>
@@ -1101,8 +1992,11 @@
           </w:tcPr>
           <w:p>
             <w:pPr>
-              <w:jc w:val="center"/>
-            </w:pPr>
+              <w:jc w:val="both"/>
+            </w:pPr>
+            <w:r>
+              <w:t>N/A</w:t>
+            </w:r>
           </w:p>
         </w:tc>
         <w:tc>
@@ -1125,8 +2019,11 @@
           </w:tcPr>
           <w:p>
             <w:pPr>
-              <w:jc w:val="center"/>
-            </w:pPr>
+              <w:jc w:val="both"/>
+            </w:pPr>
+            <w:r>
+              <w:t>Assenza di rami</w:t>
+            </w:r>
           </w:p>
         </w:tc>
       </w:tr>
@@ -1154,7 +2051,7 @@
           </w:tcPr>
           <w:p>
             <w:pPr>
-              <w:jc w:val="center"/>
+              <w:jc w:val="both"/>
             </w:pPr>
             <w:r>
               <w:rPr>
@@ -1185,8 +2082,11 @@
           </w:tcPr>
           <w:p>
             <w:pPr>
-              <w:jc w:val="center"/>
-            </w:pPr>
+              <w:jc w:val="both"/>
+            </w:pPr>
+            <w:r>
+              <w:t>N/A</w:t>
+            </w:r>
           </w:p>
         </w:tc>
         <w:tc>
@@ -1209,8 +2109,11 @@
           </w:tcPr>
           <w:p>
             <w:pPr>
-              <w:jc w:val="center"/>
-            </w:pPr>
+              <w:jc w:val="both"/>
+            </w:pPr>
+            <w:r>
+              <w:t>Test su enumerativi</w:t>
+            </w:r>
           </w:p>
         </w:tc>
       </w:tr>
@@ -1238,7 +2141,7 @@
           </w:tcPr>
           <w:p>
             <w:pPr>
-              <w:jc w:val="center"/>
+              <w:jc w:val="both"/>
             </w:pPr>
             <w:r>
               <w:rPr>
@@ -1269,8 +2172,11 @@
           </w:tcPr>
           <w:p>
             <w:pPr>
-              <w:jc w:val="center"/>
-            </w:pPr>
+              <w:jc w:val="both"/>
+            </w:pPr>
+            <w:r>
+              <w:t>N/A</w:t>
+            </w:r>
           </w:p>
         </w:tc>
         <w:tc>
@@ -1293,15 +2199,19 @@
           </w:tcPr>
           <w:p>
             <w:pPr>
-              <w:jc w:val="center"/>
-            </w:pPr>
+              <w:jc w:val="both"/>
+            </w:pPr>
+            <w:r>
+              <w:t>Esecuzione lineare</w:t>
+            </w:r>
           </w:p>
         </w:tc>
       </w:tr>
     </w:tbl>
     <w:p>
       <w:pPr>
-        <w:jc w:val="center"/>
+        <w:spacing w:after="0"/>
+        <w:jc w:val="both"/>
       </w:pPr>
     </w:p>
     <w:sectPr>
@@ -1367,9 +2277,9 @@
 <file path=word/numbering.xml><?xml version="1.0" encoding="utf-8"?>
 <w:numbering xmlns:wpc="http://schemas.microsoft.com/office/word/2010/wordprocessingCanvas" xmlns:cx="http://schemas.microsoft.com/office/drawing/2014/chartex" xmlns:cx1="http://schemas.microsoft.com/office/drawing/2015/9/8/chartex" xmlns:cx2="http://schemas.microsoft.com/office/drawing/2015/10/21/chartex" xmlns:cx3="http://schemas.microsoft.com/office/drawing/2016/5/9/chartex" xmlns:cx4="http://schemas.microsoft.com/office/drawing/2016/5/10/chartex" xmlns:cx5="http://schemas.microsoft.com/office/drawing/2016/5/11/chartex" xmlns:cx6="http://schemas.microsoft.com/office/drawing/2016/5/12/chartex" xmlns:cx7="http://schemas.microsoft.com/office/drawing/2016/5/13/chartex" xmlns:cx8="http://schemas.microsoft.com/office/drawing/2016/5/14/chartex" xmlns:mc="http://schemas.openxmlformats.org/markup-compatibility/2006" xmlns:aink="http://schemas.microsoft.com/office/drawing/2016/ink" xmlns:am3d="http://schemas.microsoft.com/office/drawing/2017/model3d" xmlns:o="urn:schemas-microsoft-com:office:office" xmlns:oel="http://schemas.microsoft.com/office/2019/extlst" xmlns:r="http://schemas.openxmlformats.org/officeDocument/2006/relationships" xmlns:m="http://schemas.openxmlformats.org/officeDocument/2006/math" xmlns:v="urn:schemas-microsoft-com:vml" xmlns:wp14="http://schemas.microsoft.com/office/word/2010/wordprocessingDrawing" xmlns:wp="http://schemas.openxmlformats.org/drawingml/2006/wordprocessingDrawing" xmlns:w10="urn:schemas-microsoft-com:office:word" xmlns:w="http://schemas.openxmlformats.org/wordprocessingml/2006/main" xmlns:w14="http://schemas.microsoft.com/office/word/2010/wordml" xmlns:w15="http://schemas.microsoft.com/office/word/2012/wordml" xmlns:w16cex="http://schemas.microsoft.com/office/word/2018/wordml/cex" xmlns:w16cid="http://schemas.microsoft.com/office/word/2016/wordml/cid" xmlns:w16="http://schemas.microsoft.com/office/word/2018/wordml" xmlns:w16du="http://schemas.microsoft.com/office/word/2023/wordml/word16du" xmlns:w16sdtdh="http://schemas.microsoft.com/office/word/2020/wordml/sdtdatahash" xmlns:w16sdtfl="http://schemas.microsoft.com/office/word/2024/wordml/sdtformatlock" xmlns:w16se="http://schemas.microsoft.com/office/word/2015/wordml/symex" xmlns:wpg="http://schemas.microsoft.com/office/word/2010/wordprocessingGroup" xmlns:wpi="http://schemas.microsoft.com/office/word/2010/wordprocessingInk" xmlns:wne="http://schemas.microsoft.com/office/word/2006/wordml" xmlns:wps="http://schemas.microsoft.com/office/word/2010/wordprocessingShape" mc:Ignorable="w14 w15 w16se w16cid w16 w16cex w16sdtdh w16sdtfl w16du wp14">
   <w:abstractNum w:abstractNumId="0" w15:restartNumberingAfterBreak="0">
-    <w:nsid w:val="4AB7057C"/>
+    <w:nsid w:val="16A32E86"/>
     <w:multiLevelType w:val="hybridMultilevel"/>
-    <w:tmpl w:val="1EA60ACE"/>
+    <w:tmpl w:val="F484EB6E"/>
     <w:lvl w:ilvl="0" w:tplc="04100001">
       <w:start w:val="1"/>
       <w:numFmt w:val="bullet"/>
@@ -1479,7 +2389,123 @@
       </w:rPr>
     </w:lvl>
   </w:abstractNum>
+  <w:abstractNum w:abstractNumId="1" w15:restartNumberingAfterBreak="0">
+    <w:nsid w:val="4AB7057C"/>
+    <w:multiLevelType w:val="hybridMultilevel"/>
+    <w:tmpl w:val="1EA60ACE"/>
+    <w:lvl w:ilvl="0" w:tplc="04100001">
+      <w:start w:val="1"/>
+      <w:numFmt w:val="bullet"/>
+      <w:lvlText w:val=""/>
+      <w:lvlJc w:val="left"/>
+      <w:pPr>
+        <w:ind w:left="720" w:hanging="360"/>
+      </w:pPr>
+      <w:rPr>
+        <w:rFonts w:ascii="Symbol" w:hAnsi="Symbol" w:hint="default"/>
+      </w:rPr>
+    </w:lvl>
+    <w:lvl w:ilvl="1" w:tplc="04100003" w:tentative="1">
+      <w:start w:val="1"/>
+      <w:numFmt w:val="bullet"/>
+      <w:lvlText w:val="o"/>
+      <w:lvlJc w:val="left"/>
+      <w:pPr>
+        <w:ind w:left="1440" w:hanging="360"/>
+      </w:pPr>
+      <w:rPr>
+        <w:rFonts w:ascii="Courier New" w:hAnsi="Courier New" w:cs="Courier New" w:hint="default"/>
+      </w:rPr>
+    </w:lvl>
+    <w:lvl w:ilvl="2" w:tplc="04100005" w:tentative="1">
+      <w:start w:val="1"/>
+      <w:numFmt w:val="bullet"/>
+      <w:lvlText w:val=""/>
+      <w:lvlJc w:val="left"/>
+      <w:pPr>
+        <w:ind w:left="2160" w:hanging="360"/>
+      </w:pPr>
+      <w:rPr>
+        <w:rFonts w:ascii="Wingdings" w:hAnsi="Wingdings" w:hint="default"/>
+      </w:rPr>
+    </w:lvl>
+    <w:lvl w:ilvl="3" w:tplc="04100001" w:tentative="1">
+      <w:start w:val="1"/>
+      <w:numFmt w:val="bullet"/>
+      <w:lvlText w:val=""/>
+      <w:lvlJc w:val="left"/>
+      <w:pPr>
+        <w:ind w:left="2880" w:hanging="360"/>
+      </w:pPr>
+      <w:rPr>
+        <w:rFonts w:ascii="Symbol" w:hAnsi="Symbol" w:hint="default"/>
+      </w:rPr>
+    </w:lvl>
+    <w:lvl w:ilvl="4" w:tplc="04100003" w:tentative="1">
+      <w:start w:val="1"/>
+      <w:numFmt w:val="bullet"/>
+      <w:lvlText w:val="o"/>
+      <w:lvlJc w:val="left"/>
+      <w:pPr>
+        <w:ind w:left="3600" w:hanging="360"/>
+      </w:pPr>
+      <w:rPr>
+        <w:rFonts w:ascii="Courier New" w:hAnsi="Courier New" w:cs="Courier New" w:hint="default"/>
+      </w:rPr>
+    </w:lvl>
+    <w:lvl w:ilvl="5" w:tplc="04100005" w:tentative="1">
+      <w:start w:val="1"/>
+      <w:numFmt w:val="bullet"/>
+      <w:lvlText w:val=""/>
+      <w:lvlJc w:val="left"/>
+      <w:pPr>
+        <w:ind w:left="4320" w:hanging="360"/>
+      </w:pPr>
+      <w:rPr>
+        <w:rFonts w:ascii="Wingdings" w:hAnsi="Wingdings" w:hint="default"/>
+      </w:rPr>
+    </w:lvl>
+    <w:lvl w:ilvl="6" w:tplc="04100001" w:tentative="1">
+      <w:start w:val="1"/>
+      <w:numFmt w:val="bullet"/>
+      <w:lvlText w:val=""/>
+      <w:lvlJc w:val="left"/>
+      <w:pPr>
+        <w:ind w:left="5040" w:hanging="360"/>
+      </w:pPr>
+      <w:rPr>
+        <w:rFonts w:ascii="Symbol" w:hAnsi="Symbol" w:hint="default"/>
+      </w:rPr>
+    </w:lvl>
+    <w:lvl w:ilvl="7" w:tplc="04100003" w:tentative="1">
+      <w:start w:val="1"/>
+      <w:numFmt w:val="bullet"/>
+      <w:lvlText w:val="o"/>
+      <w:lvlJc w:val="left"/>
+      <w:pPr>
+        <w:ind w:left="5760" w:hanging="360"/>
+      </w:pPr>
+      <w:rPr>
+        <w:rFonts w:ascii="Courier New" w:hAnsi="Courier New" w:cs="Courier New" w:hint="default"/>
+      </w:rPr>
+    </w:lvl>
+    <w:lvl w:ilvl="8" w:tplc="04100005" w:tentative="1">
+      <w:start w:val="1"/>
+      <w:numFmt w:val="bullet"/>
+      <w:lvlText w:val=""/>
+      <w:lvlJc w:val="left"/>
+      <w:pPr>
+        <w:ind w:left="6480" w:hanging="360"/>
+      </w:pPr>
+      <w:rPr>
+        <w:rFonts w:ascii="Wingdings" w:hAnsi="Wingdings" w:hint="default"/>
+      </w:rPr>
+    </w:lvl>
+  </w:abstractNum>
   <w:num w:numId="1" w16cid:durableId="391320064">
+    <w:abstractNumId w:val="1"/>
+  </w:num>
+  <w:num w:numId="2" w16cid:durableId="543563394">
     <w:abstractNumId w:val="0"/>
   </w:num>
 </w:numbering>
@@ -1885,6 +2911,7 @@
   <w:style w:type="paragraph" w:default="1" w:styleId="Normale">
     <w:name w:val="Normal"/>
     <w:qFormat/>
+    <w:rsid w:val="00E27F9E"/>
   </w:style>
   <w:style w:type="paragraph" w:styleId="Titolo1">
     <w:name w:val="heading 1"/>

</xml_diff>

<commit_message>
Piccole modifiche testing e manutenzione
</commit_message>
<xml_diff>
--- a/documentazione/Testing.docx
+++ b/documentazione/Testing.docx
@@ -69,6 +69,79 @@
     <w:p>
       <w:pPr>
         <w:pStyle w:val="Paragrafoelenco"/>
+        <w:jc w:val="both"/>
+      </w:pPr>
+    </w:p>
+    <w:p>
+      <w:pPr>
+        <w:pStyle w:val="Paragrafoelenco"/>
+        <w:jc w:val="both"/>
+      </w:pPr>
+      <w:r>
+        <w:t xml:space="preserve">Di seguito un estratto esempio di test per </w:t>
+      </w:r>
+      <w:r>
+        <w:t>la verifica dei dati in fase di registrazione:</w:t>
+      </w:r>
+    </w:p>
+    <w:p>
+      <w:pPr>
+        <w:pStyle w:val="Paragrafoelenco"/>
+        <w:jc w:val="both"/>
+      </w:pPr>
+    </w:p>
+    <w:p>
+      <w:pPr>
+        <w:pStyle w:val="Paragrafoelenco"/>
+        <w:jc w:val="both"/>
+      </w:pPr>
+      <w:r>
+        <w:drawing>
+          <wp:inline distT="0" distB="0" distL="0" distR="0" wp14:anchorId="67BE2F5D" wp14:editId="66A3D3D2">
+            <wp:extent cx="6120130" cy="1109345"/>
+            <wp:effectExtent l="0" t="0" r="0" b="0"/>
+            <wp:docPr id="1206957814" name="Immagine 1"/>
+            <wp:cNvGraphicFramePr>
+              <a:graphicFrameLocks xmlns:a="http://schemas.openxmlformats.org/drawingml/2006/main" noChangeAspect="1"/>
+            </wp:cNvGraphicFramePr>
+            <a:graphic xmlns:a="http://schemas.openxmlformats.org/drawingml/2006/main">
+              <a:graphicData uri="http://schemas.openxmlformats.org/drawingml/2006/picture">
+                <pic:pic xmlns:pic="http://schemas.openxmlformats.org/drawingml/2006/picture">
+                  <pic:nvPicPr>
+                    <pic:cNvPr id="1206957814" name=""/>
+                    <pic:cNvPicPr/>
+                  </pic:nvPicPr>
+                  <pic:blipFill>
+                    <a:blip r:embed="rId7"/>
+                    <a:stretch>
+                      <a:fillRect/>
+                    </a:stretch>
+                  </pic:blipFill>
+                  <pic:spPr>
+                    <a:xfrm>
+                      <a:off x="0" y="0"/>
+                      <a:ext cx="6120130" cy="1109345"/>
+                    </a:xfrm>
+                    <a:prstGeom prst="rect">
+                      <a:avLst/>
+                    </a:prstGeom>
+                  </pic:spPr>
+                </pic:pic>
+              </a:graphicData>
+            </a:graphic>
+          </wp:inline>
+        </w:drawing>
+      </w:r>
+    </w:p>
+    <w:p>
+      <w:pPr>
+        <w:pStyle w:val="Paragrafoelenco"/>
+        <w:jc w:val="both"/>
+      </w:pPr>
+    </w:p>
+    <w:p>
+      <w:pPr>
+        <w:pStyle w:val="Paragrafoelenco"/>
         <w:numPr>
           <w:ilvl w:val="0"/>
           <w:numId w:val="1"/>
@@ -76,10 +149,83 @@
         <w:jc w:val="both"/>
       </w:pPr>
       <w:r>
-        <w:t>Manual Testing: test manuale in seguito ad ogni modifica effettuata e prima di ogni commit</w:t>
-      </w:r>
-      <w:r>
-        <w:t>. Test effettuati tramite interfaccia Vaadin navigando tra le viste.</w:t>
+        <w:t xml:space="preserve">Manual Testing: test manuale in seguito ad ogni modifica effettuata e prima di ogni </w:t>
+      </w:r>
+      <w:proofErr w:type="spellStart"/>
+      <w:r>
+        <w:t>commit</w:t>
+      </w:r>
+      <w:proofErr w:type="spellEnd"/>
+      <w:r>
+        <w:t xml:space="preserve">. Test effettuati tramite interfaccia </w:t>
+      </w:r>
+      <w:proofErr w:type="spellStart"/>
+      <w:r>
+        <w:t>Vaadin</w:t>
+      </w:r>
+      <w:proofErr w:type="spellEnd"/>
+      <w:r>
+        <w:t xml:space="preserve"> navigando tra le viste.</w:t>
+      </w:r>
+    </w:p>
+    <w:p>
+      <w:pPr>
+        <w:pStyle w:val="Paragrafoelenco"/>
+        <w:jc w:val="both"/>
+      </w:pPr>
+    </w:p>
+    <w:p>
+      <w:pPr>
+        <w:pStyle w:val="Paragrafoelenco"/>
+        <w:jc w:val="both"/>
+      </w:pPr>
+      <w:r>
+        <w:t>Di seguito un esempio di test manuale:</w:t>
+      </w:r>
+    </w:p>
+    <w:p>
+      <w:pPr>
+        <w:pStyle w:val="Paragrafoelenco"/>
+        <w:jc w:val="both"/>
+      </w:pPr>
+      <w:r>
+        <w:t>-Accedere come Utente</w:t>
+      </w:r>
+    </w:p>
+    <w:p>
+      <w:pPr>
+        <w:pStyle w:val="Paragrafoelenco"/>
+        <w:jc w:val="both"/>
+      </w:pPr>
+      <w:r>
+        <w:t>-Selezionare colonnina</w:t>
+      </w:r>
+    </w:p>
+    <w:p>
+      <w:pPr>
+        <w:pStyle w:val="Paragrafoelenco"/>
+        <w:jc w:val="both"/>
+      </w:pPr>
+      <w:r>
+        <w:t>-Prenotare slot</w:t>
+      </w:r>
+    </w:p>
+    <w:p>
+      <w:pPr>
+        <w:pStyle w:val="Paragrafoelenco"/>
+        <w:jc w:val="both"/>
+      </w:pPr>
+      <w:r>
+        <w:t>-Risultato atteso:  la prenotazione appare nella pagina apposita</w:t>
+      </w:r>
+    </w:p>
+    <w:p>
+      <w:pPr>
+        <w:pStyle w:val="Paragrafoelenco"/>
+        <w:jc w:val="both"/>
+      </w:pPr>
+      <w:r>
+        <w:t>-Esito: Passato</w:t>
       </w:r>
     </w:p>
     <w:p>
@@ -262,6 +408,7 @@
             <w:pPr>
               <w:jc w:val="both"/>
             </w:pPr>
+            <w:proofErr w:type="spellStart"/>
             <w:r>
               <w:rPr>
                 <w:b/>
@@ -269,6 +416,7 @@
               </w:rPr>
               <w:t>DataValidatorTest</w:t>
             </w:r>
+            <w:proofErr w:type="spellEnd"/>
           </w:p>
         </w:tc>
         <w:tc>
@@ -293,9 +441,11 @@
             <w:pPr>
               <w:jc w:val="both"/>
             </w:pPr>
+            <w:proofErr w:type="spellStart"/>
             <w:r>
               <w:t>DataValidator</w:t>
             </w:r>
+            <w:proofErr w:type="spellEnd"/>
           </w:p>
         </w:tc>
         <w:tc>
@@ -359,8 +509,13 @@
               </w:numPr>
               <w:jc w:val="both"/>
             </w:pPr>
-            <w:r>
-              <w:t>Regex username e e-mail</w:t>
+            <w:proofErr w:type="spellStart"/>
+            <w:r>
+              <w:t>Regex</w:t>
+            </w:r>
+            <w:proofErr w:type="spellEnd"/>
+            <w:r>
+              <w:t xml:space="preserve"> username e e-mail</w:t>
             </w:r>
           </w:p>
         </w:tc>
@@ -391,6 +546,7 @@
             <w:pPr>
               <w:jc w:val="both"/>
             </w:pPr>
+            <w:proofErr w:type="spellStart"/>
             <w:r>
               <w:rPr>
                 <w:b/>
@@ -398,6 +554,7 @@
               </w:rPr>
               <w:t>AutoTest</w:t>
             </w:r>
+            <w:proofErr w:type="spellEnd"/>
           </w:p>
         </w:tc>
         <w:tc>
@@ -492,13 +649,16 @@
             <w:pPr>
               <w:jc w:val="both"/>
             </w:pPr>
+            <w:proofErr w:type="spellStart"/>
             <w:r>
               <w:rPr>
                 <w:b/>
                 <w:bCs/>
               </w:rPr>
+              <w:lastRenderedPageBreak/>
               <w:t>PrenotazioneTest</w:t>
             </w:r>
+            <w:proofErr w:type="spellEnd"/>
           </w:p>
         </w:tc>
         <w:tc>
@@ -591,6 +751,7 @@
             <w:pPr>
               <w:jc w:val="both"/>
             </w:pPr>
+            <w:proofErr w:type="spellStart"/>
             <w:r>
               <w:rPr>
                 <w:b/>
@@ -598,6 +759,7 @@
               </w:rPr>
               <w:t>TipoAutoTest</w:t>
             </w:r>
+            <w:proofErr w:type="spellEnd"/>
           </w:p>
         </w:tc>
         <w:tc>
@@ -622,8 +784,21 @@
             <w:pPr>
               <w:jc w:val="both"/>
             </w:pPr>
-            <w:r>
-              <w:t>TipoAuto (Enum)</w:t>
+            <w:proofErr w:type="spellStart"/>
+            <w:r>
+              <w:t>TipoAuto</w:t>
+            </w:r>
+            <w:proofErr w:type="spellEnd"/>
+            <w:r>
+              <w:t xml:space="preserve"> (</w:t>
+            </w:r>
+            <w:proofErr w:type="spellStart"/>
+            <w:r>
+              <w:t>Enum</w:t>
+            </w:r>
+            <w:proofErr w:type="spellEnd"/>
+            <w:r>
+              <w:t>)</w:t>
             </w:r>
           </w:p>
         </w:tc>
@@ -681,6 +856,7 @@
             <w:pPr>
               <w:jc w:val="both"/>
             </w:pPr>
+            <w:proofErr w:type="spellStart"/>
             <w:r>
               <w:rPr>
                 <w:b/>
@@ -688,6 +864,7 @@
               </w:rPr>
               <w:t>QRCodeTest</w:t>
             </w:r>
+            <w:proofErr w:type="spellEnd"/>
           </w:p>
         </w:tc>
         <w:tc>
@@ -712,9 +889,11 @@
             <w:pPr>
               <w:jc w:val="both"/>
             </w:pPr>
+            <w:proofErr w:type="spellStart"/>
             <w:r>
               <w:t>QRCode</w:t>
             </w:r>
+            <w:proofErr w:type="spellEnd"/>
           </w:p>
         </w:tc>
         <w:tc>
@@ -743,32 +922,17 @@
               <w:t>Verifica generazione QR code corretta senza eccezioni</w:t>
             </w:r>
             <w:r>
-              <w:t xml:space="preserve"> tramite il metodo generaQR</w:t>
-            </w:r>
+              <w:t xml:space="preserve"> tramite il metodo </w:t>
+            </w:r>
+            <w:proofErr w:type="spellStart"/>
+            <w:r>
+              <w:t>generaQR</w:t>
+            </w:r>
+            <w:proofErr w:type="spellEnd"/>
           </w:p>
         </w:tc>
       </w:tr>
     </w:tbl>
-    <w:p>
-      <w:pPr>
-        <w:jc w:val="both"/>
-      </w:pPr>
-    </w:p>
-    <w:p>
-      <w:pPr>
-        <w:jc w:val="both"/>
-      </w:pPr>
-    </w:p>
-    <w:p>
-      <w:pPr>
-        <w:jc w:val="both"/>
-      </w:pPr>
-    </w:p>
-    <w:p>
-      <w:pPr>
-        <w:jc w:val="both"/>
-      </w:pPr>
-    </w:p>
     <w:p>
       <w:pPr>
         <w:jc w:val="both"/>
@@ -799,7 +963,6 @@
           <w:iCs/>
           <w:u w:val="single"/>
         </w:rPr>
-        <w:lastRenderedPageBreak/>
         <w:t>Code Coverage</w:t>
       </w:r>
     </w:p>
@@ -813,11 +976,40 @@
       <w:r>
         <w:t xml:space="preserve">il tool </w:t>
       </w:r>
-      <w:r>
-        <w:t>EclEmma.</w:t>
-      </w:r>
-      <w:r>
-        <w:t xml:space="preserve"> La strategia di testing ha evitato le classi views e database, concentrandosi maggiormente su pacchetti utils, models e enums.</w:t>
+      <w:proofErr w:type="spellStart"/>
+      <w:r>
+        <w:t>EclEmma</w:t>
+      </w:r>
+      <w:proofErr w:type="spellEnd"/>
+      <w:r>
+        <w:t>.</w:t>
+      </w:r>
+      <w:r>
+        <w:t xml:space="preserve"> La strategia di testing ha evitato le classi </w:t>
+      </w:r>
+      <w:proofErr w:type="spellStart"/>
+      <w:r>
+        <w:t>views</w:t>
+      </w:r>
+      <w:proofErr w:type="spellEnd"/>
+      <w:r>
+        <w:t xml:space="preserve"> e database, concentrandosi maggiormente su pacchetti </w:t>
+      </w:r>
+      <w:proofErr w:type="spellStart"/>
+      <w:r>
+        <w:t>utils</w:t>
+      </w:r>
+      <w:proofErr w:type="spellEnd"/>
+      <w:r>
+        <w:t xml:space="preserve">, models e </w:t>
+      </w:r>
+      <w:proofErr w:type="spellStart"/>
+      <w:r>
+        <w:t>enums</w:t>
+      </w:r>
+      <w:proofErr w:type="spellEnd"/>
+      <w:r>
+        <w:t>.</w:t>
       </w:r>
     </w:p>
     <w:p>
@@ -953,8 +1145,17 @@
                 <w:b/>
                 <w:bCs/>
               </w:rPr>
-              <w:t>Percentuale Eclemma</w:t>
-            </w:r>
+              <w:t xml:space="preserve">Percentuale </w:t>
+            </w:r>
+            <w:proofErr w:type="spellStart"/>
+            <w:r>
+              <w:rPr>
+                <w:b/>
+                <w:bCs/>
+              </w:rPr>
+              <w:t>Eclemma</w:t>
+            </w:r>
+            <w:proofErr w:type="spellEnd"/>
           </w:p>
         </w:tc>
       </w:tr>
@@ -984,6 +1185,7 @@
             <w:pPr>
               <w:jc w:val="both"/>
             </w:pPr>
+            <w:proofErr w:type="spellStart"/>
             <w:r>
               <w:rPr>
                 <w:b/>
@@ -991,6 +1193,7 @@
               </w:rPr>
               <w:t>DataValidator</w:t>
             </w:r>
+            <w:proofErr w:type="spellEnd"/>
           </w:p>
         </w:tc>
         <w:tc>
@@ -1043,6 +1246,9 @@
               <w:jc w:val="both"/>
             </w:pPr>
             <w:r>
+              <w:rPr>
+                <w:noProof/>
+              </w:rPr>
               <w:drawing>
                 <wp:inline distT="0" distB="0" distL="0" distR="0" wp14:anchorId="6DEAA3AE" wp14:editId="68B4A1A2">
                   <wp:extent cx="2934128" cy="170180"/>
@@ -1059,7 +1265,7 @@
                           <pic:cNvPicPr/>
                         </pic:nvPicPr>
                         <pic:blipFill rotWithShape="1">
-                          <a:blip r:embed="rId7"/>
+                          <a:blip r:embed="rId8"/>
                           <a:srcRect l="2714"/>
                           <a:stretch>
                             <a:fillRect/>
@@ -1176,6 +1382,9 @@
               <w:jc w:val="both"/>
             </w:pPr>
             <w:r>
+              <w:rPr>
+                <w:noProof/>
+              </w:rPr>
               <w:drawing>
                 <wp:inline distT="0" distB="0" distL="0" distR="0" wp14:anchorId="456B48B7" wp14:editId="6336D24B">
                   <wp:extent cx="2962688" cy="171474"/>
@@ -1192,7 +1401,7 @@
                           <pic:cNvPicPr/>
                         </pic:nvPicPr>
                         <pic:blipFill>
-                          <a:blip r:embed="rId8"/>
+                          <a:blip r:embed="rId9"/>
                           <a:stretch>
                             <a:fillRect/>
                           </a:stretch>
@@ -1300,6 +1509,9 @@
               <w:jc w:val="both"/>
             </w:pPr>
             <w:r>
+              <w:rPr>
+                <w:noProof/>
+              </w:rPr>
               <w:drawing>
                 <wp:inline distT="0" distB="0" distL="0" distR="0" wp14:anchorId="7E617F0B" wp14:editId="1349109E">
                   <wp:extent cx="3010320" cy="152421"/>
@@ -1316,7 +1528,7 @@
                           <pic:cNvPicPr/>
                         </pic:nvPicPr>
                         <pic:blipFill>
-                          <a:blip r:embed="rId9"/>
+                          <a:blip r:embed="rId10"/>
                           <a:stretch>
                             <a:fillRect/>
                           </a:stretch>
@@ -1365,6 +1577,7 @@
             <w:pPr>
               <w:jc w:val="both"/>
             </w:pPr>
+            <w:proofErr w:type="spellStart"/>
             <w:r>
               <w:rPr>
                 <w:b/>
@@ -1372,6 +1585,7 @@
               </w:rPr>
               <w:t>TipoAuto</w:t>
             </w:r>
+            <w:proofErr w:type="spellEnd"/>
           </w:p>
         </w:tc>
         <w:tc>
@@ -1424,6 +1638,9 @@
               <w:jc w:val="both"/>
             </w:pPr>
             <w:r>
+              <w:rPr>
+                <w:noProof/>
+              </w:rPr>
               <w:drawing>
                 <wp:inline distT="0" distB="0" distL="0" distR="0" wp14:anchorId="29141D23" wp14:editId="15CE9F76">
                   <wp:extent cx="3038899" cy="181000"/>
@@ -1440,7 +1657,7 @@
                           <pic:cNvPicPr/>
                         </pic:nvPicPr>
                         <pic:blipFill>
-                          <a:blip r:embed="rId10"/>
+                          <a:blip r:embed="rId11"/>
                           <a:stretch>
                             <a:fillRect/>
                           </a:stretch>
@@ -1489,6 +1706,7 @@
             <w:pPr>
               <w:jc w:val="both"/>
             </w:pPr>
+            <w:proofErr w:type="spellStart"/>
             <w:r>
               <w:rPr>
                 <w:b/>
@@ -1496,6 +1714,7 @@
               </w:rPr>
               <w:t>QRCode</w:t>
             </w:r>
+            <w:proofErr w:type="spellEnd"/>
           </w:p>
         </w:tc>
         <w:tc>
@@ -1548,6 +1767,9 @@
               <w:jc w:val="both"/>
             </w:pPr>
             <w:r>
+              <w:rPr>
+                <w:noProof/>
+              </w:rPr>
               <w:drawing>
                 <wp:inline distT="0" distB="0" distL="0" distR="0" wp14:anchorId="03622411" wp14:editId="2D652689">
                   <wp:extent cx="2981741" cy="152421"/>
@@ -1564,7 +1786,7 @@
                           <pic:cNvPicPr/>
                         </pic:nvPicPr>
                         <pic:blipFill>
-                          <a:blip r:embed="rId11"/>
+                          <a:blip r:embed="rId12"/>
                           <a:stretch>
                             <a:fillRect/>
                           </a:stretch>
@@ -1622,8 +1844,35 @@
         <w:spacing w:after="0"/>
         <w:jc w:val="both"/>
       </w:pPr>
-      <w:r>
-        <w:t>Analizzando la branch-coverage otteniamo:</w:t>
+    </w:p>
+    <w:p>
+      <w:pPr>
+        <w:spacing w:after="0"/>
+        <w:jc w:val="both"/>
+      </w:pPr>
+    </w:p>
+    <w:p>
+      <w:pPr>
+        <w:spacing w:after="0"/>
+        <w:jc w:val="both"/>
+      </w:pPr>
+    </w:p>
+    <w:p>
+      <w:pPr>
+        <w:spacing w:after="0"/>
+        <w:jc w:val="both"/>
+      </w:pPr>
+      <w:r>
+        <w:lastRenderedPageBreak/>
+        <w:t xml:space="preserve">Analizzando la </w:t>
+      </w:r>
+      <w:proofErr w:type="spellStart"/>
+      <w:r>
+        <w:t>branch</w:t>
+      </w:r>
+      <w:proofErr w:type="spellEnd"/>
+      <w:r>
+        <w:t>-coverage otteniamo:</w:t>
       </w:r>
     </w:p>
     <w:p>
@@ -1783,6 +2032,7 @@
             <w:pPr>
               <w:jc w:val="both"/>
             </w:pPr>
+            <w:proofErr w:type="spellStart"/>
             <w:r>
               <w:rPr>
                 <w:b/>
@@ -1790,6 +2040,7 @@
               </w:rPr>
               <w:t>DataValidator</w:t>
             </w:r>
+            <w:proofErr w:type="spellEnd"/>
           </w:p>
         </w:tc>
         <w:tc>
@@ -2053,6 +2304,7 @@
             <w:pPr>
               <w:jc w:val="both"/>
             </w:pPr>
+            <w:proofErr w:type="spellStart"/>
             <w:r>
               <w:rPr>
                 <w:b/>
@@ -2060,6 +2312,7 @@
               </w:rPr>
               <w:t>TipoAuto</w:t>
             </w:r>
+            <w:proofErr w:type="spellEnd"/>
           </w:p>
         </w:tc>
         <w:tc>
@@ -2143,6 +2396,7 @@
             <w:pPr>
               <w:jc w:val="both"/>
             </w:pPr>
+            <w:proofErr w:type="spellStart"/>
             <w:r>
               <w:rPr>
                 <w:b/>
@@ -2150,6 +2404,7 @@
               </w:rPr>
               <w:t>QRCode</w:t>
             </w:r>
+            <w:proofErr w:type="spellEnd"/>
           </w:p>
         </w:tc>
         <w:tc>
@@ -2392,7 +2647,7 @@
   <w:abstractNum w:abstractNumId="1" w15:restartNumberingAfterBreak="0">
     <w:nsid w:val="4AB7057C"/>
     <w:multiLevelType w:val="hybridMultilevel"/>
-    <w:tmpl w:val="1EA60ACE"/>
+    <w:tmpl w:val="0576BD4A"/>
     <w:lvl w:ilvl="0" w:tplc="04100001">
       <w:start w:val="1"/>
       <w:numFmt w:val="bullet"/>

</xml_diff>